<commit_message>
Completed Task 6: UML Class Diagram
Added the UML Class Diagram for the Student Activities Management System, including classes, attributes, methods, associations, multiplicities, and inheritance. Also added the project reflection
</commit_message>
<xml_diff>
--- a/_ IT353 Project_ (4).docx
+++ b/_ IT353 Project_ (4).docx
@@ -73,10 +73,11 @@
                               <w:dataBinding w:prefixMappings="xmlns:ns0='http://purl.org/dc/elements/1.1/' xmlns:ns1='http://schemas.openxmlformats.org/package/2006/metadata/core-properties' " w:xpath="/ns1:coreProperties[1]/ns0:title[1]" w:storeItemID="{6C3C8BC8-F283-45AE-878A-BAB7291924A1}"/>
                               <w:text/>
                             </w:sdtPr>
+                            <w:sdtEndPr/>
                             <w:sdtContent>
                               <w:p>
                                 <w:pPr>
-                                  <w:pStyle w:val="a9"/>
+                                  <w:pStyle w:val="Title"/>
                                   <w:jc w:val="center"/>
                                   <w:rPr>
                                     <w:sz w:val="56"/>
@@ -95,7 +96,7 @@
                           </w:sdt>
                           <w:p>
                             <w:pPr>
-                              <w:pStyle w:val="a6"/>
+                              <w:pStyle w:val="Subtitle"/>
                               <w:spacing w:after="120" w:line="240" w:lineRule="auto"/>
                               <w:ind w:left="706" w:right="720"/>
                               <w:jc w:val="center"/>
@@ -131,6 +132,7 @@
                                 <w:dataBinding w:prefixMappings="xmlns:ns0='http://purl.org/dc/elements/1.1/' xmlns:ns1='http://schemas.openxmlformats.org/package/2006/metadata/core-properties' " w:xpath="/ns1:coreProperties[1]/ns0:subject[1]" w:storeItemID="{6C3C8BC8-F283-45AE-878A-BAB7291924A1}"/>
                                 <w:text/>
                               </w:sdtPr>
+                              <w:sdtEndPr/>
                               <w:sdtContent>
                                 <w:r>
                                   <w:rPr>
@@ -494,6 +496,7 @@
                               <w:dataBinding w:prefixMappings="xmlns:ns0='http://schemas.microsoft.com/office/2006/coverPageProps'" w:xpath="/ns0:CoverPageProperties[1]/ns0:Abstract[1]" w:storeItemID="{55AF091B-3C7A-41E3-B477-F2FDAA23CFDA}"/>
                               <w:text/>
                             </w:sdtPr>
+                            <w:sdtEndPr/>
                             <w:sdtContent>
                               <w:p>
                                 <w:pPr>
@@ -586,10 +589,11 @@
                         <w:dataBinding w:prefixMappings="xmlns:ns0='http://purl.org/dc/elements/1.1/' xmlns:ns1='http://schemas.openxmlformats.org/package/2006/metadata/core-properties' " w:xpath="/ns1:coreProperties[1]/ns0:title[1]" w:storeItemID="{6C3C8BC8-F283-45AE-878A-BAB7291924A1}"/>
                         <w:text/>
                       </w:sdtPr>
+                      <w:sdtEndPr/>
                       <w:sdtContent>
                         <w:p>
                           <w:pPr>
-                            <w:pStyle w:val="a9"/>
+                            <w:pStyle w:val="Title"/>
                             <w:jc w:val="center"/>
                             <w:rPr>
                               <w:sz w:val="56"/>
@@ -608,7 +612,7 @@
                     </w:sdt>
                     <w:p>
                       <w:pPr>
-                        <w:pStyle w:val="a6"/>
+                        <w:pStyle w:val="Subtitle"/>
                         <w:spacing w:after="120" w:line="240" w:lineRule="auto"/>
                         <w:ind w:left="706" w:right="720"/>
                         <w:jc w:val="center"/>
@@ -644,6 +648,7 @@
                           <w:dataBinding w:prefixMappings="xmlns:ns0='http://purl.org/dc/elements/1.1/' xmlns:ns1='http://schemas.openxmlformats.org/package/2006/metadata/core-properties' " w:xpath="/ns1:coreProperties[1]/ns0:subject[1]" w:storeItemID="{6C3C8BC8-F283-45AE-878A-BAB7291924A1}"/>
                           <w:text/>
                         </w:sdtPr>
+                        <w:sdtEndPr/>
                         <w:sdtContent>
                           <w:r>
                             <w:rPr>
@@ -1007,6 +1012,7 @@
                         <w:dataBinding w:prefixMappings="xmlns:ns0='http://schemas.microsoft.com/office/2006/coverPageProps'" w:xpath="/ns0:CoverPageProperties[1]/ns0:Abstract[1]" w:storeItemID="{55AF091B-3C7A-41E3-B477-F2FDAA23CFDA}"/>
                         <w:text/>
                       </w:sdtPr>
+                      <w:sdtEndPr/>
                       <w:sdtContent>
                         <w:p>
                           <w:pPr>
@@ -1340,6 +1346,7 @@
           <w:docPartUnique/>
         </w:docPartObj>
       </w:sdtPr>
+      <w:sdtEndPr/>
       <w:sdtContent>
         <w:p/>
         <w:p>
@@ -1356,7 +1363,7 @@
             <mc:AlternateContent>
               <mc:Choice Requires="wpg">
                 <w:drawing>
-                  <wp:anchor distT="45720" distB="45720" distL="182880" distR="182880" simplePos="0" relativeHeight="251677696" behindDoc="0" locked="0" layoutInCell="1" allowOverlap="1" wp14:anchorId="31857F9A" wp14:editId="6864EF05">
+                  <wp:anchor distT="45720" distB="45720" distL="182880" distR="182880" simplePos="0" relativeHeight="251677696" behindDoc="0" locked="0" layoutInCell="1" allowOverlap="1" wp14:anchorId="31857F9A" wp14:editId="402EE7F4">
                     <wp:simplePos x="0" y="0"/>
                     <wp:positionH relativeFrom="margin">
                       <wp:posOffset>-1292860</wp:posOffset>
@@ -1484,7 +1491,7 @@
                               <w:txbxContent>
                                 <w:p>
                                   <w:pPr>
-                                    <w:pStyle w:val="af5"/>
+                                    <w:pStyle w:val="ListParagraph"/>
                                     <w:numPr>
                                       <w:ilvl w:val="0"/>
                                       <w:numId w:val="6"/>
@@ -1553,7 +1560,7 @@
                                 </w:p>
                                 <w:p>
                                   <w:pPr>
-                                    <w:pStyle w:val="af5"/>
+                                    <w:pStyle w:val="ListParagraph"/>
                                     <w:numPr>
                                       <w:ilvl w:val="0"/>
                                       <w:numId w:val="6"/>
@@ -1574,7 +1581,7 @@
                                 </w:p>
                                 <w:p>
                                   <w:pPr>
-                                    <w:pStyle w:val="af5"/>
+                                    <w:pStyle w:val="ListParagraph"/>
                                     <w:numPr>
                                       <w:ilvl w:val="0"/>
                                       <w:numId w:val="6"/>
@@ -1686,7 +1693,7 @@
                                 </w:p>
                                 <w:p>
                                   <w:pPr>
-                                    <w:pStyle w:val="af5"/>
+                                    <w:pStyle w:val="ListParagraph"/>
                                     <w:numPr>
                                       <w:ilvl w:val="0"/>
                                       <w:numId w:val="6"/>
@@ -1708,7 +1715,7 @@
                                 </w:p>
                                 <w:p>
                                   <w:pPr>
-                                    <w:pStyle w:val="af5"/>
+                                    <w:pStyle w:val="ListParagraph"/>
                                     <w:numPr>
                                       <w:ilvl w:val="0"/>
                                       <w:numId w:val="6"/>
@@ -1736,7 +1743,7 @@
                                 </w:p>
                                 <w:p>
                                   <w:pPr>
-                                    <w:pStyle w:val="af5"/>
+                                    <w:pStyle w:val="ListParagraph"/>
                                     <w:numPr>
                                       <w:ilvl w:val="0"/>
                                       <w:numId w:val="6"/>
@@ -1758,7 +1765,7 @@
                                 </w:p>
                                 <w:p>
                                   <w:pPr>
-                                    <w:pStyle w:val="af5"/>
+                                    <w:pStyle w:val="ListParagraph"/>
                                     <w:numPr>
                                       <w:ilvl w:val="0"/>
                                       <w:numId w:val="6"/>
@@ -1805,7 +1812,7 @@
                                 </w:p>
                                 <w:p>
                                   <w:pPr>
-                                    <w:pStyle w:val="af5"/>
+                                    <w:pStyle w:val="ListParagraph"/>
                                     <w:numPr>
                                       <w:ilvl w:val="0"/>
                                       <w:numId w:val="6"/>
@@ -1827,7 +1834,7 @@
                                 </w:p>
                                 <w:p>
                                   <w:pPr>
-                                    <w:pStyle w:val="af5"/>
+                                    <w:pStyle w:val="ListParagraph"/>
                                     <w:numPr>
                                       <w:ilvl w:val="0"/>
                                       <w:numId w:val="6"/>
@@ -1867,7 +1874,7 @@
                                 </w:p>
                                 <w:p>
                                   <w:pPr>
-                                    <w:pStyle w:val="af5"/>
+                                    <w:pStyle w:val="ListParagraph"/>
                                     <w:numPr>
                                       <w:ilvl w:val="0"/>
                                       <w:numId w:val="6"/>
@@ -1964,7 +1971,7 @@
                         <w:txbxContent>
                           <w:p>
                             <w:pPr>
-                              <w:pStyle w:val="af5"/>
+                              <w:pStyle w:val="ListParagraph"/>
                               <w:numPr>
                                 <w:ilvl w:val="0"/>
                                 <w:numId w:val="6"/>
@@ -2033,7 +2040,7 @@
                           </w:p>
                           <w:p>
                             <w:pPr>
-                              <w:pStyle w:val="af5"/>
+                              <w:pStyle w:val="ListParagraph"/>
                               <w:numPr>
                                 <w:ilvl w:val="0"/>
                                 <w:numId w:val="6"/>
@@ -2054,7 +2061,7 @@
                           </w:p>
                           <w:p>
                             <w:pPr>
-                              <w:pStyle w:val="af5"/>
+                              <w:pStyle w:val="ListParagraph"/>
                               <w:numPr>
                                 <w:ilvl w:val="0"/>
                                 <w:numId w:val="6"/>
@@ -2166,7 +2173,7 @@
                           </w:p>
                           <w:p>
                             <w:pPr>
-                              <w:pStyle w:val="af5"/>
+                              <w:pStyle w:val="ListParagraph"/>
                               <w:numPr>
                                 <w:ilvl w:val="0"/>
                                 <w:numId w:val="6"/>
@@ -2188,7 +2195,7 @@
                           </w:p>
                           <w:p>
                             <w:pPr>
-                              <w:pStyle w:val="af5"/>
+                              <w:pStyle w:val="ListParagraph"/>
                               <w:numPr>
                                 <w:ilvl w:val="0"/>
                                 <w:numId w:val="6"/>
@@ -2216,7 +2223,7 @@
                           </w:p>
                           <w:p>
                             <w:pPr>
-                              <w:pStyle w:val="af5"/>
+                              <w:pStyle w:val="ListParagraph"/>
                               <w:numPr>
                                 <w:ilvl w:val="0"/>
                                 <w:numId w:val="6"/>
@@ -2238,7 +2245,7 @@
                           </w:p>
                           <w:p>
                             <w:pPr>
-                              <w:pStyle w:val="af5"/>
+                              <w:pStyle w:val="ListParagraph"/>
                               <w:numPr>
                                 <w:ilvl w:val="0"/>
                                 <w:numId w:val="6"/>
@@ -2285,7 +2292,7 @@
                           </w:p>
                           <w:p>
                             <w:pPr>
-                              <w:pStyle w:val="af5"/>
+                              <w:pStyle w:val="ListParagraph"/>
                               <w:numPr>
                                 <w:ilvl w:val="0"/>
                                 <w:numId w:val="6"/>
@@ -2307,7 +2314,7 @@
                           </w:p>
                           <w:p>
                             <w:pPr>
-                              <w:pStyle w:val="af5"/>
+                              <w:pStyle w:val="ListParagraph"/>
                               <w:numPr>
                                 <w:ilvl w:val="0"/>
                                 <w:numId w:val="6"/>
@@ -2347,7 +2354,7 @@
                           </w:p>
                           <w:p>
                             <w:pPr>
-                              <w:pStyle w:val="af5"/>
+                              <w:pStyle w:val="ListParagraph"/>
                               <w:numPr>
                                 <w:ilvl w:val="0"/>
                                 <w:numId w:val="6"/>
@@ -2404,7 +2411,7 @@
             <mc:AlternateContent>
               <mc:Choice Requires="wps">
                 <w:drawing>
-                  <wp:anchor distT="0" distB="0" distL="114300" distR="114300" simplePos="0" relativeHeight="251675648" behindDoc="0" locked="0" layoutInCell="1" allowOverlap="0" wp14:anchorId="7CBAAF0B" wp14:editId="15930ABC">
+                  <wp:anchor distT="0" distB="0" distL="114300" distR="114300" simplePos="0" relativeHeight="251675648" behindDoc="0" locked="0" layoutInCell="1" allowOverlap="0" wp14:anchorId="7CBAAF0B" wp14:editId="40F355BE">
                     <wp:simplePos x="0" y="0"/>
                     <wp:positionH relativeFrom="page">
                       <wp:posOffset>463550</wp:posOffset>
@@ -2463,6 +2470,7 @@
                                     <w:dataBinding w:prefixMappings="xmlns:ns0='http://schemas.openxmlformats.org/officeDocument/2006/extended-properties' " w:xpath="/ns0:Properties[1]/ns0:Company[1]" w:storeItemID="{6668398D-A668-4E3E-A5EB-62B293D839F1}"/>
                                     <w:text/>
                                   </w:sdtPr>
+                                  <w:sdtEndPr/>
                                   <w:sdtContent>
                                     <w:r>
                                       <w:t>Student Details:                                            CRN:</w:t>
@@ -2534,7 +2542,7 @@
                                     </w:tcPr>
                                     <w:p>
                                       <w:pPr>
-                                        <w:pStyle w:val="a5"/>
+                                        <w:pStyle w:val="Footer"/>
                                         <w:rPr>
                                           <w:b/>
                                           <w:bCs/>
@@ -2572,7 +2580,7 @@
                                     </w:p>
                                     <w:p>
                                       <w:pPr>
-                                        <w:pStyle w:val="a5"/>
+                                        <w:pStyle w:val="Footer"/>
                                         <w:rPr>
                                           <w:b/>
                                           <w:bCs/>
@@ -2601,7 +2609,7 @@
                                     </w:p>
                                     <w:p>
                                       <w:pPr>
-                                        <w:pStyle w:val="a5"/>
+                                        <w:pStyle w:val="Footer"/>
                                         <w:rPr>
                                           <w:b/>
                                           <w:bCs/>
@@ -2630,7 +2638,7 @@
                                     </w:p>
                                     <w:p>
                                       <w:pPr>
-                                        <w:pStyle w:val="a5"/>
+                                        <w:pStyle w:val="Footer"/>
                                         <w:rPr>
                                           <w:b/>
                                           <w:bCs/>
@@ -2659,7 +2667,7 @@
                                     </w:p>
                                     <w:p>
                                       <w:pPr>
-                                        <w:pStyle w:val="a5"/>
+                                        <w:pStyle w:val="Footer"/>
                                         <w:rPr>
                                           <w:b/>
                                           <w:bCs/>
@@ -2676,6 +2684,24 @@
                                         </w:rPr>
                                         <w:t>Name:</w:t>
                                       </w:r>
+                                      <w:r>
+                                        <w:rPr>
+                                          <w:b/>
+                                          <w:bCs/>
+                                          <w:sz w:val="28"/>
+                                          <w:szCs w:val="28"/>
+                                        </w:rPr>
+                                        <w:t xml:space="preserve">SHATHA </w:t>
+                                      </w:r>
+                                      <w:r>
+                                        <w:rPr>
+                                          <w:b/>
+                                          <w:bCs/>
+                                          <w:sz w:val="28"/>
+                                          <w:szCs w:val="28"/>
+                                        </w:rPr>
+                                        <w:t>KHALED BAQAIS</w:t>
+                                      </w:r>
                                     </w:p>
                                   </w:tc>
                                   <w:tc>
@@ -2687,7 +2713,7 @@
                                     </w:tcPr>
                                     <w:p>
                                       <w:pPr>
-                                        <w:pStyle w:val="a5"/>
+                                        <w:pStyle w:val="Footer"/>
                                         <w:ind w:left="0"/>
                                         <w:rPr>
                                           <w:b/>
@@ -2705,7 +2731,7 @@
                                     </w:tcPr>
                                     <w:p>
                                       <w:pPr>
-                                        <w:pStyle w:val="a5"/>
+                                        <w:pStyle w:val="Footer"/>
                                         <w:rPr>
                                           <w:b/>
                                           <w:bCs/>
@@ -2734,7 +2760,7 @@
                                     </w:p>
                                     <w:p>
                                       <w:pPr>
-                                        <w:pStyle w:val="a5"/>
+                                        <w:pStyle w:val="Footer"/>
                                         <w:rPr>
                                           <w:b/>
                                           <w:bCs/>
@@ -2763,7 +2789,7 @@
                                     </w:p>
                                     <w:p>
                                       <w:pPr>
-                                        <w:pStyle w:val="a5"/>
+                                        <w:pStyle w:val="Footer"/>
                                         <w:rPr>
                                           <w:b/>
                                           <w:bCs/>
@@ -2792,7 +2818,7 @@
                                     </w:p>
                                     <w:p>
                                       <w:pPr>
-                                        <w:pStyle w:val="a5"/>
+                                        <w:pStyle w:val="Footer"/>
                                         <w:rPr>
                                           <w:b/>
                                           <w:bCs/>
@@ -2821,7 +2847,7 @@
                                     </w:p>
                                     <w:p>
                                       <w:pPr>
-                                        <w:pStyle w:val="a5"/>
+                                        <w:pStyle w:val="Footer"/>
                                         <w:rPr>
                                           <w:b/>
                                           <w:bCs/>
@@ -2838,10 +2864,19 @@
                                         </w:rPr>
                                         <w:t>ID:</w:t>
                                       </w:r>
+                                      <w:r>
+                                        <w:rPr>
+                                          <w:b/>
+                                          <w:bCs/>
+                                          <w:sz w:val="28"/>
+                                          <w:szCs w:val="28"/>
+                                        </w:rPr>
+                                        <w:t>S240067735</w:t>
+                                      </w:r>
                                     </w:p>
                                     <w:p>
                                       <w:pPr>
-                                        <w:pStyle w:val="a5"/>
+                                        <w:pStyle w:val="Footer"/>
                                         <w:rPr>
                                           <w:b/>
                                           <w:bCs/>
@@ -2863,7 +2898,7 @@
                                     </w:tcPr>
                                     <w:p>
                                       <w:pPr>
-                                        <w:pStyle w:val="a5"/>
+                                        <w:pStyle w:val="Footer"/>
                                         <w:rPr>
                                           <w:b/>
                                           <w:bCs/>
@@ -2882,7 +2917,7 @@
                                     </w:tcPr>
                                     <w:p>
                                       <w:pPr>
-                                        <w:pStyle w:val="a5"/>
+                                        <w:pStyle w:val="Footer"/>
                                         <w:ind w:left="0"/>
                                         <w:rPr>
                                           <w:b/>
@@ -2900,7 +2935,7 @@
                                     </w:tcPr>
                                     <w:p>
                                       <w:pPr>
-                                        <w:pStyle w:val="a5"/>
+                                        <w:pStyle w:val="Footer"/>
                                         <w:rPr>
                                           <w:b/>
                                           <w:bCs/>
@@ -2923,7 +2958,7 @@
                                     </w:tcPr>
                                     <w:p>
                                       <w:pPr>
-                                        <w:pStyle w:val="a5"/>
+                                        <w:pStyle w:val="Footer"/>
                                       </w:pPr>
                                     </w:p>
                                   </w:tc>
@@ -2934,7 +2969,7 @@
                                     </w:tcPr>
                                     <w:p>
                                       <w:pPr>
-                                        <w:pStyle w:val="a5"/>
+                                        <w:pStyle w:val="Footer"/>
                                       </w:pPr>
                                     </w:p>
                                   </w:tc>
@@ -2945,7 +2980,7 @@
                                     </w:tcPr>
                                     <w:p>
                                       <w:pPr>
-                                        <w:pStyle w:val="a5"/>
+                                        <w:pStyle w:val="Footer"/>
                                       </w:pPr>
                                     </w:p>
                                   </w:tc>
@@ -2953,7 +2988,7 @@
                               </w:tbl>
                               <w:p>
                                 <w:pPr>
-                                  <w:pStyle w:val="ad"/>
+                                  <w:pStyle w:val="NoSpacing"/>
                                 </w:pPr>
                               </w:p>
                             </w:txbxContent>
@@ -2978,11 +3013,7 @@
               </mc:Choice>
               <mc:Fallback>
                 <w:pict>
-                  <v:shapetype w14:anchorId="7CBAAF0B" id="_x0000_t202" coordsize="21600,21600" o:spt="202" path="m,l,21600r21600,l21600,xe">
-                    <v:stroke joinstyle="miter"/>
-                    <v:path gradientshapeok="t" o:connecttype="rect"/>
-                  </v:shapetype>
-                  <v:shape id="Text Box 15" o:spid="_x0000_s1031" type="#_x0000_t202" alt="contact info" style="position:absolute;margin-left:36.5pt;margin-top:226.65pt;width:540pt;height:114pt;z-index:251675648;visibility:visible;mso-wrap-style:square;mso-width-percent:1282;mso-height-percent:0;mso-wrap-distance-left:9pt;mso-wrap-distance-top:0;mso-wrap-distance-right:9pt;mso-wrap-distance-bottom:0;mso-position-horizontal:absolute;mso-position-horizontal-relative:page;mso-position-vertical:absolute;mso-position-vertical-relative:margin;mso-width-percent:1282;mso-height-percent:0;mso-width-relative:margin;mso-height-relative:margin;v-text-anchor:bottom" o:gfxdata="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" o:allowoverlap="f" filled="f" stroked="f" strokeweight=".5pt">
+                  <v:shape w14:anchorId="7CBAAF0B" id="Text Box 15" o:spid="_x0000_s1031" type="#_x0000_t202" alt="contact info" style="position:absolute;margin-left:36.5pt;margin-top:226.65pt;width:540pt;height:114pt;z-index:251675648;visibility:visible;mso-wrap-style:square;mso-width-percent:1282;mso-height-percent:0;mso-wrap-distance-left:9pt;mso-wrap-distance-top:0;mso-wrap-distance-right:9pt;mso-wrap-distance-bottom:0;mso-position-horizontal:absolute;mso-position-horizontal-relative:page;mso-position-vertical:absolute;mso-position-vertical-relative:margin;mso-width-percent:1282;mso-height-percent:0;mso-width-relative:margin;mso-height-relative:margin;v-text-anchor:bottom" o:gfxdata="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" o:allowoverlap="f" filled="f" stroked="f" strokeweight=".5pt">
                     <v:textbox inset="0,0,0,0">
                       <w:txbxContent>
                         <w:p>
@@ -2997,6 +3028,7 @@
                               <w:dataBinding w:prefixMappings="xmlns:ns0='http://schemas.openxmlformats.org/officeDocument/2006/extended-properties' " w:xpath="/ns0:Properties[1]/ns0:Company[1]" w:storeItemID="{6668398D-A668-4E3E-A5EB-62B293D839F1}"/>
                               <w:text/>
                             </w:sdtPr>
+                            <w:sdtEndPr/>
                             <w:sdtContent>
                               <w:r>
                                 <w:t>Student Details:                                            CRN:</w:t>
@@ -3068,7 +3100,7 @@
                               </w:tcPr>
                               <w:p>
                                 <w:pPr>
-                                  <w:pStyle w:val="a5"/>
+                                  <w:pStyle w:val="Footer"/>
                                   <w:rPr>
                                     <w:b/>
                                     <w:bCs/>
@@ -3106,7 +3138,7 @@
                               </w:p>
                               <w:p>
                                 <w:pPr>
-                                  <w:pStyle w:val="a5"/>
+                                  <w:pStyle w:val="Footer"/>
                                   <w:rPr>
                                     <w:b/>
                                     <w:bCs/>
@@ -3135,7 +3167,7 @@
                               </w:p>
                               <w:p>
                                 <w:pPr>
-                                  <w:pStyle w:val="a5"/>
+                                  <w:pStyle w:val="Footer"/>
                                   <w:rPr>
                                     <w:b/>
                                     <w:bCs/>
@@ -3164,7 +3196,7 @@
                               </w:p>
                               <w:p>
                                 <w:pPr>
-                                  <w:pStyle w:val="a5"/>
+                                  <w:pStyle w:val="Footer"/>
                                   <w:rPr>
                                     <w:b/>
                                     <w:bCs/>
@@ -3193,7 +3225,7 @@
                               </w:p>
                               <w:p>
                                 <w:pPr>
-                                  <w:pStyle w:val="a5"/>
+                                  <w:pStyle w:val="Footer"/>
                                   <w:rPr>
                                     <w:b/>
                                     <w:bCs/>
@@ -3210,6 +3242,24 @@
                                   </w:rPr>
                                   <w:t>Name:</w:t>
                                 </w:r>
+                                <w:r>
+                                  <w:rPr>
+                                    <w:b/>
+                                    <w:bCs/>
+                                    <w:sz w:val="28"/>
+                                    <w:szCs w:val="28"/>
+                                  </w:rPr>
+                                  <w:t xml:space="preserve">SHATHA </w:t>
+                                </w:r>
+                                <w:r>
+                                  <w:rPr>
+                                    <w:b/>
+                                    <w:bCs/>
+                                    <w:sz w:val="28"/>
+                                    <w:szCs w:val="28"/>
+                                  </w:rPr>
+                                  <w:t>KHALED BAQAIS</w:t>
+                                </w:r>
                               </w:p>
                             </w:tc>
                             <w:tc>
@@ -3221,7 +3271,7 @@
                               </w:tcPr>
                               <w:p>
                                 <w:pPr>
-                                  <w:pStyle w:val="a5"/>
+                                  <w:pStyle w:val="Footer"/>
                                   <w:ind w:left="0"/>
                                   <w:rPr>
                                     <w:b/>
@@ -3239,7 +3289,7 @@
                               </w:tcPr>
                               <w:p>
                                 <w:pPr>
-                                  <w:pStyle w:val="a5"/>
+                                  <w:pStyle w:val="Footer"/>
                                   <w:rPr>
                                     <w:b/>
                                     <w:bCs/>
@@ -3268,7 +3318,7 @@
                               </w:p>
                               <w:p>
                                 <w:pPr>
-                                  <w:pStyle w:val="a5"/>
+                                  <w:pStyle w:val="Footer"/>
                                   <w:rPr>
                                     <w:b/>
                                     <w:bCs/>
@@ -3297,7 +3347,7 @@
                               </w:p>
                               <w:p>
                                 <w:pPr>
-                                  <w:pStyle w:val="a5"/>
+                                  <w:pStyle w:val="Footer"/>
                                   <w:rPr>
                                     <w:b/>
                                     <w:bCs/>
@@ -3326,7 +3376,7 @@
                               </w:p>
                               <w:p>
                                 <w:pPr>
-                                  <w:pStyle w:val="a5"/>
+                                  <w:pStyle w:val="Footer"/>
                                   <w:rPr>
                                     <w:b/>
                                     <w:bCs/>
@@ -3355,7 +3405,7 @@
                               </w:p>
                               <w:p>
                                 <w:pPr>
-                                  <w:pStyle w:val="a5"/>
+                                  <w:pStyle w:val="Footer"/>
                                   <w:rPr>
                                     <w:b/>
                                     <w:bCs/>
@@ -3372,10 +3422,19 @@
                                   </w:rPr>
                                   <w:t>ID:</w:t>
                                 </w:r>
+                                <w:r>
+                                  <w:rPr>
+                                    <w:b/>
+                                    <w:bCs/>
+                                    <w:sz w:val="28"/>
+                                    <w:szCs w:val="28"/>
+                                  </w:rPr>
+                                  <w:t>S240067735</w:t>
+                                </w:r>
                               </w:p>
                               <w:p>
                                 <w:pPr>
-                                  <w:pStyle w:val="a5"/>
+                                  <w:pStyle w:val="Footer"/>
                                   <w:rPr>
                                     <w:b/>
                                     <w:bCs/>
@@ -3397,7 +3456,7 @@
                               </w:tcPr>
                               <w:p>
                                 <w:pPr>
-                                  <w:pStyle w:val="a5"/>
+                                  <w:pStyle w:val="Footer"/>
                                   <w:rPr>
                                     <w:b/>
                                     <w:bCs/>
@@ -3416,7 +3475,7 @@
                               </w:tcPr>
                               <w:p>
                                 <w:pPr>
-                                  <w:pStyle w:val="a5"/>
+                                  <w:pStyle w:val="Footer"/>
                                   <w:ind w:left="0"/>
                                   <w:rPr>
                                     <w:b/>
@@ -3434,7 +3493,7 @@
                               </w:tcPr>
                               <w:p>
                                 <w:pPr>
-                                  <w:pStyle w:val="a5"/>
+                                  <w:pStyle w:val="Footer"/>
                                   <w:rPr>
                                     <w:b/>
                                     <w:bCs/>
@@ -3457,7 +3516,7 @@
                               </w:tcPr>
                               <w:p>
                                 <w:pPr>
-                                  <w:pStyle w:val="a5"/>
+                                  <w:pStyle w:val="Footer"/>
                                 </w:pPr>
                               </w:p>
                             </w:tc>
@@ -3468,7 +3527,7 @@
                               </w:tcPr>
                               <w:p>
                                 <w:pPr>
-                                  <w:pStyle w:val="a5"/>
+                                  <w:pStyle w:val="Footer"/>
                                 </w:pPr>
                               </w:p>
                             </w:tc>
@@ -3479,7 +3538,7 @@
                               </w:tcPr>
                               <w:p>
                                 <w:pPr>
-                                  <w:pStyle w:val="a5"/>
+                                  <w:pStyle w:val="Footer"/>
                                 </w:pPr>
                               </w:p>
                             </w:tc>
@@ -3487,7 +3546,7 @@
                         </w:tbl>
                         <w:p>
                           <w:pPr>
-                            <w:pStyle w:val="ad"/>
+                            <w:pStyle w:val="NoSpacing"/>
                           </w:pPr>
                         </w:p>
                       </w:txbxContent>
@@ -3523,7 +3582,7 @@
     </w:p>
     <w:p>
       <w:pPr>
-        <w:pStyle w:val="1"/>
+        <w:pStyle w:val="Heading1"/>
       </w:pPr>
       <w:r>
         <w:lastRenderedPageBreak/>
@@ -3532,7 +3591,7 @@
     </w:p>
     <w:p>
       <w:pPr>
-        <w:pStyle w:val="af5"/>
+        <w:pStyle w:val="ListParagraph"/>
         <w:numPr>
           <w:ilvl w:val="0"/>
           <w:numId w:val="20"/>
@@ -3556,7 +3615,7 @@
     </w:p>
     <w:p>
       <w:pPr>
-        <w:pStyle w:val="af5"/>
+        <w:pStyle w:val="ListParagraph"/>
         <w:rPr>
           <w:sz w:val="24"/>
           <w:szCs w:val="24"/>
@@ -3572,7 +3631,7 @@
     </w:p>
     <w:p>
       <w:pPr>
-        <w:pStyle w:val="af5"/>
+        <w:pStyle w:val="ListParagraph"/>
         <w:numPr>
           <w:ilvl w:val="1"/>
           <w:numId w:val="20"/>
@@ -3592,7 +3651,7 @@
     </w:p>
     <w:p>
       <w:pPr>
-        <w:pStyle w:val="af5"/>
+        <w:pStyle w:val="ListParagraph"/>
         <w:numPr>
           <w:ilvl w:val="1"/>
           <w:numId w:val="20"/>
@@ -3612,7 +3671,7 @@
     </w:p>
     <w:p>
       <w:pPr>
-        <w:pStyle w:val="af5"/>
+        <w:pStyle w:val="ListParagraph"/>
         <w:numPr>
           <w:ilvl w:val="1"/>
           <w:numId w:val="20"/>
@@ -3632,7 +3691,7 @@
     </w:p>
     <w:p>
       <w:pPr>
-        <w:pStyle w:val="af5"/>
+        <w:pStyle w:val="ListParagraph"/>
         <w:numPr>
           <w:ilvl w:val="1"/>
           <w:numId w:val="20"/>
@@ -3652,7 +3711,7 @@
     </w:p>
     <w:p>
       <w:pPr>
-        <w:pStyle w:val="af5"/>
+        <w:pStyle w:val="ListParagraph"/>
         <w:numPr>
           <w:ilvl w:val="1"/>
           <w:numId w:val="20"/>
@@ -3672,7 +3731,7 @@
     </w:p>
     <w:p>
       <w:pPr>
-        <w:pStyle w:val="af5"/>
+        <w:pStyle w:val="ListParagraph"/>
         <w:numPr>
           <w:ilvl w:val="1"/>
           <w:numId w:val="20"/>
@@ -3713,7 +3772,7 @@
     </w:p>
     <w:p>
       <w:pPr>
-        <w:pStyle w:val="af5"/>
+        <w:pStyle w:val="ListParagraph"/>
         <w:numPr>
           <w:ilvl w:val="0"/>
           <w:numId w:val="20"/>
@@ -3737,7 +3796,7 @@
     </w:p>
     <w:p>
       <w:pPr>
-        <w:pStyle w:val="af5"/>
+        <w:pStyle w:val="ListParagraph"/>
         <w:rPr>
           <w:sz w:val="24"/>
           <w:szCs w:val="24"/>
@@ -3802,7 +3861,7 @@
     </w:p>
     <w:p>
       <w:pPr>
-        <w:pStyle w:val="af5"/>
+        <w:pStyle w:val="ListParagraph"/>
         <w:rPr>
           <w:sz w:val="24"/>
           <w:szCs w:val="24"/>
@@ -3888,7 +3947,7 @@
     </w:p>
     <w:p>
       <w:pPr>
-        <w:pStyle w:val="af5"/>
+        <w:pStyle w:val="ListParagraph"/>
         <w:rPr>
           <w:sz w:val="24"/>
           <w:szCs w:val="24"/>
@@ -3908,42 +3967,26 @@
           <w:sz w:val="24"/>
           <w:szCs w:val="24"/>
         </w:rPr>
-        <w:t xml:space="preserve"> Students must not write their report elsewhere and paste the final </w:t>
-      </w:r>
-      <w:proofErr w:type="gramStart"/>
+        <w:t xml:space="preserve"> Students must not write their report elsewhere and paste the final version in at the last minute. They also should not make a single commit containing your entire </w:t>
+      </w:r>
       <w:r>
         <w:rPr>
           <w:sz w:val="24"/>
           <w:szCs w:val="24"/>
         </w:rPr>
-        <w:t>version in</w:t>
-      </w:r>
-      <w:proofErr w:type="gramEnd"/>
+        <w:t>files</w:t>
+      </w:r>
       <w:r>
         <w:rPr>
           <w:sz w:val="24"/>
           <w:szCs w:val="24"/>
         </w:rPr>
-        <w:t xml:space="preserve"> at the last minute. They also should not make a single commit containing your entire </w:t>
-      </w:r>
-      <w:r>
-        <w:rPr>
-          <w:sz w:val="24"/>
-          <w:szCs w:val="24"/>
-        </w:rPr>
-        <w:t>files</w:t>
-      </w:r>
-      <w:r>
-        <w:rPr>
-          <w:sz w:val="24"/>
-          <w:szCs w:val="24"/>
-        </w:rPr>
         <w:t>. Both are treated as red flags regardless of the quality of the final work.</w:t>
       </w:r>
     </w:p>
     <w:p>
       <w:pPr>
-        <w:pStyle w:val="af5"/>
+        <w:pStyle w:val="ListParagraph"/>
         <w:numPr>
           <w:ilvl w:val="0"/>
           <w:numId w:val="20"/>
@@ -3967,7 +4010,7 @@
     </w:p>
     <w:p>
       <w:pPr>
-        <w:pStyle w:val="af5"/>
+        <w:pStyle w:val="ListParagraph"/>
         <w:rPr>
           <w:sz w:val="24"/>
           <w:szCs w:val="24"/>
@@ -3997,7 +4040,7 @@
     </w:p>
     <w:p>
       <w:pPr>
-        <w:pStyle w:val="af5"/>
+        <w:pStyle w:val="ListParagraph"/>
         <w:numPr>
           <w:ilvl w:val="1"/>
           <w:numId w:val="20"/>
@@ -4012,12 +4055,13 @@
           <w:sz w:val="24"/>
           <w:szCs w:val="24"/>
         </w:rPr>
+        <w:lastRenderedPageBreak/>
         <w:t>Describe one specific challenge or obstacle you encountered during this project and explain in detail how you identified and resolved it.</w:t>
       </w:r>
     </w:p>
     <w:p>
       <w:pPr>
-        <w:pStyle w:val="af5"/>
+        <w:pStyle w:val="ListParagraph"/>
         <w:numPr>
           <w:ilvl w:val="1"/>
           <w:numId w:val="20"/>
@@ -4032,28 +4076,12 @@
           <w:sz w:val="24"/>
           <w:szCs w:val="24"/>
         </w:rPr>
-        <w:t xml:space="preserve">Explain why you chose your specific approach/method/model over at least one alternative you considered, and what tradeoffs informed </w:t>
-      </w:r>
-      <w:proofErr w:type="gramStart"/>
-      <w:r>
-        <w:rPr>
-          <w:sz w:val="24"/>
-          <w:szCs w:val="24"/>
-        </w:rPr>
-        <w:t>that</w:t>
-      </w:r>
-      <w:proofErr w:type="gramEnd"/>
-      <w:r>
-        <w:rPr>
-          <w:sz w:val="24"/>
-          <w:szCs w:val="24"/>
-        </w:rPr>
-        <w:t xml:space="preserve"> decision.</w:t>
-      </w:r>
-    </w:p>
-    <w:p>
-      <w:pPr>
-        <w:pStyle w:val="af5"/>
+        <w:t>Explain why you chose your specific approach/method/model over at least one alternative you considered, and what tradeoffs informed that decision.</w:t>
+      </w:r>
+    </w:p>
+    <w:p>
+      <w:pPr>
+        <w:pStyle w:val="ListParagraph"/>
         <w:numPr>
           <w:ilvl w:val="1"/>
           <w:numId w:val="20"/>
@@ -4073,7 +4101,7 @@
     </w:p>
     <w:p>
       <w:pPr>
-        <w:pStyle w:val="af5"/>
+        <w:pStyle w:val="ListParagraph"/>
         <w:numPr>
           <w:ilvl w:val="1"/>
           <w:numId w:val="20"/>
@@ -4103,15 +4131,16 @@
     <w:p/>
     <w:p>
       <w:pPr>
-        <w:pStyle w:val="1"/>
-      </w:pPr>
-      <w:r>
+        <w:pStyle w:val="Heading1"/>
+      </w:pPr>
+      <w:r>
+        <w:lastRenderedPageBreak/>
         <w:t>Important Notes</w:t>
       </w:r>
     </w:p>
     <w:p>
       <w:pPr>
-        <w:pStyle w:val="af5"/>
+        <w:pStyle w:val="ListParagraph"/>
         <w:numPr>
           <w:ilvl w:val="0"/>
           <w:numId w:val="21"/>
@@ -4144,7 +4173,7 @@
     </w:p>
     <w:p>
       <w:pPr>
-        <w:pStyle w:val="af5"/>
+        <w:pStyle w:val="ListParagraph"/>
         <w:numPr>
           <w:ilvl w:val="0"/>
           <w:numId w:val="21"/>
@@ -4164,7 +4193,7 @@
     </w:p>
     <w:p>
       <w:pPr>
-        <w:pStyle w:val="af5"/>
+        <w:pStyle w:val="ListParagraph"/>
         <w:numPr>
           <w:ilvl w:val="0"/>
           <w:numId w:val="21"/>
@@ -4194,9 +4223,10 @@
     <w:p/>
     <w:p>
       <w:pPr>
-        <w:pStyle w:val="1"/>
-      </w:pPr>
-      <w:r>
+        <w:pStyle w:val="Heading1"/>
+      </w:pPr>
+      <w:r>
+        <w:lastRenderedPageBreak/>
         <w:t>Project Rubric</w:t>
       </w:r>
     </w:p>
@@ -4764,7 +4794,7 @@
     <w:p/>
     <w:p>
       <w:pPr>
-        <w:pStyle w:val="1"/>
+        <w:pStyle w:val="Heading1"/>
         <w:rPr>
           <w:rFonts w:ascii="Times New Roman" w:hAnsi="Times New Roman" w:cs="Times New Roman"/>
           <w:sz w:val="36"/>
@@ -4776,6 +4806,7 @@
           <w:noProof/>
           <w:lang w:eastAsia="en-US"/>
         </w:rPr>
+        <w:lastRenderedPageBreak/>
         <mc:AlternateContent>
           <mc:Choice Requires="wps">
             <w:drawing>
@@ -4955,16 +4986,16 @@
                         <w:txbxContent>
                           <w:p>
                             <w:pPr>
-                              <w:pStyle w:val="af"/>
+                              <w:pStyle w:val="Quote"/>
                               <w:rPr>
-                                <w:rStyle w:val="Char5"/>
+                                <w:rStyle w:val="QuoteChar"/>
                                 <w:i/>
                                 <w:iCs/>
                               </w:rPr>
                             </w:pPr>
                             <w:r>
                               <w:rPr>
-                                <w:rStyle w:val="Char5"/>
+                                <w:rStyle w:val="QuoteChar"/>
                                 <w:i/>
                                 <w:iCs/>
                               </w:rPr>
@@ -4973,16 +5004,16 @@
                           </w:p>
                           <w:p>
                             <w:pPr>
-                              <w:pStyle w:val="af"/>
+                              <w:pStyle w:val="Quote"/>
                               <w:rPr>
-                                <w:rStyle w:val="Char5"/>
+                                <w:rStyle w:val="QuoteChar"/>
                                 <w:i/>
                                 <w:iCs/>
                               </w:rPr>
                             </w:pPr>
                             <w:r>
                               <w:rPr>
-                                <w:rStyle w:val="Char5"/>
+                                <w:rStyle w:val="QuoteChar"/>
                                 <w:i/>
                                 <w:iCs/>
                               </w:rPr>
@@ -5031,16 +5062,16 @@
                   <w:txbxContent>
                     <w:p>
                       <w:pPr>
-                        <w:pStyle w:val="af"/>
+                        <w:pStyle w:val="Quote"/>
                         <w:rPr>
-                          <w:rStyle w:val="Char5"/>
+                          <w:rStyle w:val="QuoteChar"/>
                           <w:i/>
                           <w:iCs/>
                         </w:rPr>
                       </w:pPr>
                       <w:r>
                         <w:rPr>
-                          <w:rStyle w:val="Char5"/>
+                          <w:rStyle w:val="QuoteChar"/>
                           <w:i/>
                           <w:iCs/>
                         </w:rPr>
@@ -5049,16 +5080,16 @@
                     </w:p>
                     <w:p>
                       <w:pPr>
-                        <w:pStyle w:val="af"/>
+                        <w:pStyle w:val="Quote"/>
                         <w:rPr>
-                          <w:rStyle w:val="Char5"/>
+                          <w:rStyle w:val="QuoteChar"/>
                           <w:i/>
                           <w:iCs/>
                         </w:rPr>
                       </w:pPr>
                       <w:r>
                         <w:rPr>
-                          <w:rStyle w:val="Char5"/>
+                          <w:rStyle w:val="QuoteChar"/>
                           <w:i/>
                           <w:iCs/>
                         </w:rPr>
@@ -5105,15 +5136,7 @@
     </w:p>
     <w:p>
       <w:r>
-        <w:t xml:space="preserve">Activity organizers should be able to create, edit, publish, and cancel activities, define participant limits, registration periods, locations (physical or virtual), attendance methods, and eligibility requirements. Organizers should also manage participant lists, approve registrations when </w:t>
-      </w:r>
-      <w:proofErr w:type="gramStart"/>
-      <w:r>
-        <w:t>required</w:t>
-      </w:r>
-      <w:proofErr w:type="gramEnd"/>
-      <w:r>
-        <w:t>, record attendance, issue participation certificates, and generate reports on attendance rates and student engagement.</w:t>
+        <w:t>Activity organizers should be able to create, edit, publish, and cancel activities, define participant limits, registration periods, locations (physical or virtual), attendance methods, and eligibility requirements. Organizers should also manage participant lists, approve registrations when required, record attendance, issue participation certificates, and generate reports on attendance rates and student engagement.</w:t>
       </w:r>
     </w:p>
     <w:p>
@@ -5128,15 +5151,7 @@
     </w:p>
     <w:p>
       <w:r>
-        <w:t xml:space="preserve">The university expects </w:t>
-      </w:r>
-      <w:proofErr w:type="gramStart"/>
-      <w:r>
-        <w:t>the</w:t>
-      </w:r>
-      <w:proofErr w:type="gramEnd"/>
-      <w:r>
-        <w:t xml:space="preserve"> new system to improve student engagement, simplify activity management, eliminate manual attendance tracking, and provide accurate records of students' extracurricular involvement throughout their university studies.</w:t>
+        <w:t>The university expects the new system to improve student engagement, simplify activity management, eliminate manual attendance tracking, and provide accurate records of students' extracurricular involvement throughout their university studies.</w:t>
       </w:r>
     </w:p>
     <w:p>
@@ -5156,9 +5171,10 @@
     </w:p>
     <w:p>
       <w:pPr>
-        <w:pStyle w:val="1"/>
-      </w:pPr>
-      <w:r>
+        <w:pStyle w:val="Heading1"/>
+      </w:pPr>
+      <w:r>
+        <w:lastRenderedPageBreak/>
         <w:t>Task 1</w:t>
       </w:r>
     </w:p>
@@ -5405,31 +5421,7 @@
     <w:p/>
     <w:p>
       <w:r>
-        <w:t xml:space="preserve">When I first started this </w:t>
-      </w:r>
-      <w:proofErr w:type="gramStart"/>
-      <w:r>
-        <w:t>project ,</w:t>
-      </w:r>
-      <w:proofErr w:type="gramEnd"/>
-      <w:r>
-        <w:t xml:space="preserve"> I thought creating a Gantt chart would be simple. I expected it to involve just adding tasks with dates, but once I began using </w:t>
-      </w:r>
-      <w:proofErr w:type="spellStart"/>
-      <w:r>
-        <w:t>TeamGantt</w:t>
-      </w:r>
-      <w:proofErr w:type="spellEnd"/>
-      <w:r>
-        <w:t xml:space="preserve">, I </w:t>
-      </w:r>
-      <w:proofErr w:type="spellStart"/>
-      <w:r>
-        <w:t>realised</w:t>
-      </w:r>
-      <w:proofErr w:type="spellEnd"/>
-      <w:r>
-        <w:t xml:space="preserve"> there was much more to it. I had to think carefully about the order of each task, estimate realistic durations, and connect the activities using dependencies. At the beginning, I made several mistakes with the dates and task relationships, which made the schedule look confusing. Instead of giving up, I went back, reviewed everything, and kept improving it until it made sense.</w:t>
+        <w:t>When I first started this project , I thought creating a Gantt chart would be simple. I expected it to involve just adding tasks with dates, but once I began using TeamGantt, I realised there was much more to it. I had to think carefully about the order of each task, estimate realistic durations, and connect the activities using dependencies. At the beginning, I made several mistakes with the dates and task relationships, which made the schedule look confusing. Instead of giving up, I went back, reviewed everything, and kept improving it until it made sense.</w:t>
       </w:r>
     </w:p>
     <w:p>
@@ -5439,15 +5431,7 @@
     </w:p>
     <w:p>
       <w:r>
-        <w:t xml:space="preserve">Another challenge was working </w:t>
-      </w:r>
-      <w:proofErr w:type="gramStart"/>
-      <w:r>
-        <w:t>with</w:t>
-      </w:r>
-      <w:proofErr w:type="gramEnd"/>
-      <w:r>
-        <w:t xml:space="preserve"> the project deadline. I had to adjust the schedule several times because I wanted all the tasks to finish before the submission date while also taking weekends into account. This taught me that effective planning is flexible and sometimes requires making changes until everything fits together logically, and that small adjustments can prevent bigger problems.</w:t>
+        <w:t>Another challenge was working with the project deadline. I had to adjust the schedule several times because I wanted all the tasks to finish before the submission date while also taking weekends into account. This taught me that effective planning is flexible and sometimes requires making changes until everything fits together logically, and that small adjustments can prevent bigger problems.</w:t>
       </w:r>
     </w:p>
     <w:p>
@@ -5457,58 +5441,27 @@
     </w:p>
     <w:p>
       <w:r>
-        <w:t xml:space="preserve">Using </w:t>
-      </w:r>
-      <w:proofErr w:type="spellStart"/>
-      <w:r>
-        <w:t>TeamGantt</w:t>
-      </w:r>
-      <w:proofErr w:type="spellEnd"/>
-      <w:r>
-        <w:t xml:space="preserve"> was a new experience for me. At first, I found the interface confusing, especially when adding dependencies and adjusting task durations. However, after spending more time </w:t>
-      </w:r>
-      <w:proofErr w:type="spellStart"/>
-      <w:r>
-        <w:t>practising</w:t>
-      </w:r>
-      <w:proofErr w:type="spellEnd"/>
-      <w:r>
-        <w:t xml:space="preserve">, I became more comfortable with it. By the end of the assignment, I felt much more confident and understood how project management tools help </w:t>
-      </w:r>
-      <w:proofErr w:type="spellStart"/>
-      <w:r>
-        <w:t>organise</w:t>
-      </w:r>
-      <w:proofErr w:type="spellEnd"/>
-      <w:r>
-        <w:t xml:space="preserve"> work and track progress.</w:t>
-      </w:r>
-    </w:p>
-    <w:p>
-      <w:r>
-        <w:t xml:space="preserve">Overall, this assignment taught me more than how to create a Gantt chart. It showed me the importance of planning before starting any project, thinking logically about task sequences, and paying attention to detail. I believe these are practical skills that I can use not only in my university projects but also in my future career, especially when managing teams and deadlines. Looking back, I am satisfied with </w:t>
-      </w:r>
-      <w:proofErr w:type="gramStart"/>
-      <w:r>
-        <w:t>the final result</w:t>
-      </w:r>
-      <w:proofErr w:type="gramEnd"/>
-      <w:r>
-        <w:t xml:space="preserve"> because I learned something new and improved my problem-solving and planning skills throughout the process.</w:t>
+        <w:t>Using TeamGantt was a new experience for me. At first, I found the interface confusing, especially when adding dependencies and adjusting task durations. However, after spending more time practising, I became more comfortable with it. By the end of the assignment, I felt much more confident and understood how project management tools help organise work and track progress.</w:t>
+      </w:r>
+    </w:p>
+    <w:p>
+      <w:r>
+        <w:t>Overall, this assignment taught me more than how to create a Gantt chart. It showed me the importance of planning before starting any project, thinking logically about task sequences, and paying attention to detail. I believe these are practical skills that I can use not only in my university projects but also in my future career, especially when managing teams and deadlines. Looking back, I am satisfied with the final result because I learned something new and improved my problem-solving and planning skills throughout the process.</w:t>
       </w:r>
     </w:p>
     <w:p/>
     <w:p>
       <w:pPr>
-        <w:pStyle w:val="1"/>
-      </w:pPr>
-      <w:r>
+        <w:pStyle w:val="Heading1"/>
+      </w:pPr>
+      <w:r>
+        <w:lastRenderedPageBreak/>
         <w:t>Task 2</w:t>
       </w:r>
     </w:p>
     <w:p>
       <w:pPr>
-        <w:pStyle w:val="af5"/>
+        <w:pStyle w:val="ListParagraph"/>
         <w:numPr>
           <w:ilvl w:val="0"/>
           <w:numId w:val="23"/>
@@ -5529,7 +5482,7 @@
     </w:p>
     <w:p>
       <w:pPr>
-        <w:pStyle w:val="af5"/>
+        <w:pStyle w:val="ListParagraph"/>
         <w:numPr>
           <w:ilvl w:val="0"/>
           <w:numId w:val="22"/>
@@ -5550,7 +5503,7 @@
     </w:p>
     <w:p>
       <w:pPr>
-        <w:pStyle w:val="af5"/>
+        <w:pStyle w:val="ListParagraph"/>
         <w:numPr>
           <w:ilvl w:val="0"/>
           <w:numId w:val="22"/>
@@ -5635,7 +5588,7 @@
     </w:p>
     <w:p>
       <w:pPr>
-        <w:pStyle w:val="af5"/>
+        <w:pStyle w:val="ListParagraph"/>
         <w:numPr>
           <w:ilvl w:val="0"/>
           <w:numId w:val="25"/>
@@ -5746,6 +5699,7 @@
           <w:sz w:val="32"/>
           <w:szCs w:val="32"/>
         </w:rPr>
+        <w:lastRenderedPageBreak/>
         <w:t>Screen 1: Home</w:t>
       </w:r>
     </w:p>
@@ -6015,45 +5969,13 @@
       </w:r>
       <w:r>
         <w:noBreakHyphen/>
-        <w:t xml:space="preserve">fidelity prototype, was a valuable experience for me. My responsibility was to choose a suitable prototyping approach, design three main screens for the Student Activities Management </w:t>
-      </w:r>
-      <w:proofErr w:type="gramStart"/>
-      <w:r>
-        <w:t>System, and</w:t>
-      </w:r>
-      <w:proofErr w:type="gramEnd"/>
-      <w:r>
-        <w:t xml:space="preserve"> explain why the selected approach was appropriate. This task helped me understand that interface design is not only about making the screens look good, but also about making them simple and easy for users to use.</w:t>
+        <w:t>fidelity prototype, was a valuable experience for me. My responsibility was to choose a suitable prototyping approach, design three main screens for the Student Activities Management System, and explain why the selected approach was appropriate. This task helped me understand that interface design is not only about making the screens look good, but also about making them simple and easy for users to use.</w:t>
       </w:r>
     </w:p>
     <w:p/>
     <w:p>
       <w:r>
-        <w:t xml:space="preserve">The biggest challenge I faced was creating the prototype itself. At first, I found it difficult to decide where to place each element and how to </w:t>
-      </w:r>
-      <w:proofErr w:type="spellStart"/>
-      <w:r>
-        <w:t>organise</w:t>
-      </w:r>
-      <w:proofErr w:type="spellEnd"/>
-      <w:r>
-        <w:t xml:space="preserve"> the screens in a clear and simple way. I spent time changing the layout several times until I was satisfied with </w:t>
-      </w:r>
-      <w:proofErr w:type="gramStart"/>
-      <w:r>
-        <w:t>the final result</w:t>
-      </w:r>
-      <w:proofErr w:type="gramEnd"/>
-      <w:r>
-        <w:t xml:space="preserve">. Although it was challenging, I enjoyed the process. When I finally saw the completed prototype, I felt proud because it felt as though I had created something new from my own ideas. I even wished I could add </w:t>
-      </w:r>
-      <w:proofErr w:type="spellStart"/>
-      <w:r>
-        <w:t>colours</w:t>
-      </w:r>
-      <w:proofErr w:type="spellEnd"/>
-      <w:r>
-        <w:t xml:space="preserve"> and make it look more realistic, but since the project required a low</w:t>
+        <w:t>The biggest challenge I faced was creating the prototype itself. At first, I found it difficult to decide where to place each element and how to organise the screens in a clear and simple way. I spent time changing the layout several times until I was satisfied with the final result. Although it was challenging, I enjoyed the process. When I finally saw the completed prototype, I felt proud because it felt as though I had created something new from my own ideas. I even wished I could add colours and make it look more realistic, but since the project required a low</w:t>
       </w:r>
       <w:r>
         <w:noBreakHyphen/>
@@ -6069,15 +5991,7 @@
     <w:p/>
     <w:p>
       <w:r>
-        <w:t xml:space="preserve">During this project, I used ChatGPT only as a supporting tool. I used it to help me understand some project requirements, improve the grammar of my writing, and </w:t>
-      </w:r>
-      <w:proofErr w:type="spellStart"/>
-      <w:r>
-        <w:t>organise</w:t>
-      </w:r>
-      <w:proofErr w:type="spellEnd"/>
-      <w:r>
-        <w:t xml:space="preserve"> my ideas more clearly. I did not copy the responses directly. Instead, I reviewed the suggestions carefully, compared them with the project instructions, and rewrote the content in my own words to ensure it reflected my understanding and matched the project requirements.</w:t>
+        <w:t>During this project, I used ChatGPT only as a supporting tool. I used it to help me understand some project requirements, improve the grammar of my writing, and organise my ideas more clearly. I did not copy the responses directly. Instead, I reviewed the suggestions carefully, compared them with the project instructions, and rewrote the content in my own words to ensure it reflected my understanding and matched the project requirements.</w:t>
       </w:r>
     </w:p>
     <w:p/>
@@ -6088,9 +6002,10 @@
     </w:p>
     <w:p>
       <w:pPr>
-        <w:pStyle w:val="1"/>
-      </w:pPr>
-      <w:r>
+        <w:pStyle w:val="Heading1"/>
+      </w:pPr>
+      <w:r>
+        <w:lastRenderedPageBreak/>
         <w:t>Task 3</w:t>
       </w:r>
     </w:p>
@@ -6101,7 +6016,7 @@
     </w:p>
     <w:p>
       <w:pPr>
-        <w:pStyle w:val="af5"/>
+        <w:pStyle w:val="ListParagraph"/>
         <w:numPr>
           <w:ilvl w:val="0"/>
           <w:numId w:val="12"/>
@@ -6121,7 +6036,7 @@
     </w:p>
     <w:p>
       <w:pPr>
-        <w:pStyle w:val="af5"/>
+        <w:pStyle w:val="ListParagraph"/>
         <w:numPr>
           <w:ilvl w:val="0"/>
           <w:numId w:val="12"/>
@@ -6131,26 +6046,17 @@
           <w:szCs w:val="24"/>
         </w:rPr>
       </w:pPr>
-      <w:proofErr w:type="gramStart"/>
       <w:r>
         <w:rPr>
           <w:sz w:val="24"/>
           <w:szCs w:val="24"/>
         </w:rPr>
-        <w:t>Level-0</w:t>
-      </w:r>
-      <w:proofErr w:type="gramEnd"/>
-      <w:r>
-        <w:rPr>
-          <w:sz w:val="24"/>
-          <w:szCs w:val="24"/>
-        </w:rPr>
-        <w:t xml:space="preserve"> DFD</w:t>
-      </w:r>
-    </w:p>
-    <w:p>
-      <w:pPr>
-        <w:pStyle w:val="af5"/>
+        <w:t>Level-0 DFD</w:t>
+      </w:r>
+    </w:p>
+    <w:p>
+      <w:pPr>
+        <w:pStyle w:val="ListParagraph"/>
         <w:numPr>
           <w:ilvl w:val="0"/>
           <w:numId w:val="12"/>
@@ -6172,23 +6078,7 @@
           <w:sz w:val="24"/>
           <w:szCs w:val="24"/>
         </w:rPr>
-        <w:t xml:space="preserve"> </w:t>
-      </w:r>
-      <w:proofErr w:type="gramStart"/>
-      <w:r>
-        <w:rPr>
-          <w:sz w:val="24"/>
-          <w:szCs w:val="24"/>
-        </w:rPr>
-        <w:t>Level-1</w:t>
-      </w:r>
-      <w:proofErr w:type="gramEnd"/>
-      <w:r>
-        <w:rPr>
-          <w:sz w:val="24"/>
-          <w:szCs w:val="24"/>
-        </w:rPr>
-        <w:t xml:space="preserve"> DFD for </w:t>
+        <w:t xml:space="preserve"> Level-1 DFD for </w:t>
       </w:r>
       <w:r>
         <w:rPr>
@@ -6315,7 +6205,6 @@
       <w:pPr>
         <w:ind w:left="360"/>
       </w:pPr>
-      <w:proofErr w:type="gramStart"/>
       <w:r>
         <w:rPr>
           <w:b/>
@@ -6323,29 +6212,9 @@
           <w:sz w:val="32"/>
           <w:szCs w:val="32"/>
         </w:rPr>
-        <w:t>Level-0</w:t>
-      </w:r>
-      <w:proofErr w:type="gramEnd"/>
-      <w:r>
-        <w:rPr>
-          <w:b/>
-          <w:bCs/>
-          <w:sz w:val="32"/>
-          <w:szCs w:val="32"/>
-        </w:rPr>
-        <w:t xml:space="preserve"> </w:t>
-      </w:r>
-      <w:proofErr w:type="gramStart"/>
-      <w:r>
-        <w:rPr>
-          <w:b/>
-          <w:bCs/>
-          <w:sz w:val="32"/>
-          <w:szCs w:val="32"/>
-        </w:rPr>
-        <w:t>DFD :</w:t>
-      </w:r>
-      <w:proofErr w:type="gramEnd"/>
+        <w:lastRenderedPageBreak/>
+        <w:t>Level-0 DFD :</w:t>
+      </w:r>
       <w:r>
         <w:t xml:space="preserve"> </w:t>
       </w:r>
@@ -6484,7 +6353,6 @@
           <w:szCs w:val="32"/>
         </w:rPr>
       </w:pPr>
-      <w:proofErr w:type="gramStart"/>
       <w:r>
         <w:rPr>
           <w:b/>
@@ -6494,19 +6362,8 @@
           <w:szCs w:val="32"/>
           <w:shd w:val="clear" w:color="auto" w:fill="ECECEC"/>
         </w:rPr>
-        <w:t>Level-1</w:t>
-      </w:r>
-      <w:proofErr w:type="gramEnd"/>
-      <w:r>
-        <w:rPr>
-          <w:b/>
-          <w:bCs/>
-          <w:color w:val="000000"/>
-          <w:sz w:val="32"/>
-          <w:szCs w:val="32"/>
-          <w:shd w:val="clear" w:color="auto" w:fill="ECECEC"/>
-        </w:rPr>
-        <w:t xml:space="preserve"> DFD: Process 1.0</w:t>
+        <w:lastRenderedPageBreak/>
+        <w:t>Level-1 DFD: Process 1.0</w:t>
       </w:r>
     </w:p>
     <w:p>
@@ -6588,7 +6445,6 @@
           <w:szCs w:val="32"/>
         </w:rPr>
       </w:pPr>
-      <w:proofErr w:type="gramStart"/>
       <w:r>
         <w:rPr>
           <w:b/>
@@ -6598,19 +6454,8 @@
           <w:szCs w:val="32"/>
           <w:shd w:val="clear" w:color="auto" w:fill="ECECEC"/>
         </w:rPr>
-        <w:t>Level-1</w:t>
-      </w:r>
-      <w:proofErr w:type="gramEnd"/>
-      <w:r>
-        <w:rPr>
-          <w:b/>
-          <w:bCs/>
-          <w:color w:val="000000"/>
-          <w:sz w:val="32"/>
-          <w:szCs w:val="32"/>
-          <w:shd w:val="clear" w:color="auto" w:fill="ECECEC"/>
-        </w:rPr>
-        <w:t xml:space="preserve"> DFD: Process 2.0:</w:t>
+        <w:lastRenderedPageBreak/>
+        <w:t>Level-1 DFD: Process 2.0:</w:t>
       </w:r>
     </w:p>
     <w:p>
@@ -6672,7 +6517,6 @@
           <w:szCs w:val="32"/>
         </w:rPr>
       </w:pPr>
-      <w:proofErr w:type="gramStart"/>
       <w:r>
         <w:rPr>
           <w:b/>
@@ -6682,19 +6526,7 @@
           <w:szCs w:val="32"/>
           <w:shd w:val="clear" w:color="auto" w:fill="ECECEC"/>
         </w:rPr>
-        <w:t>Level-1</w:t>
-      </w:r>
-      <w:proofErr w:type="gramEnd"/>
-      <w:r>
-        <w:rPr>
-          <w:b/>
-          <w:bCs/>
-          <w:color w:val="000000"/>
-          <w:sz w:val="32"/>
-          <w:szCs w:val="32"/>
-          <w:shd w:val="clear" w:color="auto" w:fill="ECECEC"/>
-        </w:rPr>
-        <w:t xml:space="preserve"> DFD: Process 3.0:</w:t>
+        <w:t>Level-1 DFD: Process 3.0:</w:t>
       </w:r>
     </w:p>
     <w:p>
@@ -6791,131 +6623,39 @@
           <w:sz w:val="22"/>
           <w:szCs w:val="22"/>
         </w:rPr>
-        <w:t xml:space="preserve">week, my main responsibility was to analyze the system requirements and translate them into a structured set of Data Flow Diagrams (DFDs), including the Context Diagram, </w:t>
-      </w:r>
-      <w:proofErr w:type="gramStart"/>
+        <w:t>week, my main responsibility was to analyze the system requirements and translate them into a structured set of Data Flow Diagrams (DFDs), including the Context Diagram, Level-0 DFD, and three detailed Level-1 DFDs for the major system processes.</w:t>
+      </w:r>
+    </w:p>
+    <w:p/>
+    <w:p>
       <w:r>
         <w:rPr>
           <w:color w:val="000000"/>
           <w:sz w:val="22"/>
           <w:szCs w:val="22"/>
         </w:rPr>
-        <w:t>Level-0</w:t>
-      </w:r>
-      <w:proofErr w:type="gramEnd"/>
+        <w:t>One of the most significant challenges I faced during this task was ensuring proper balancing and consistency across the different diagram levels. Initially, I struggled to correctly map the data inputs and outputs between external entities and data stores without creating redundant flows. For instance, differentiating between read-only data accesses and write operations for the Activity, Registration, and Attendance databases required careful attention. I noticed this problem when reviewing my early sketches, where the connections appeared cluttered and hard to follow. To solve this, I systematically reviewed standard Gane-Sarson notation rules, broke down each process into distinct subprocesses, and double-checked that all incoming and outgoing data flows matched across the Level-0 and Level-1 diagrams.</w:t>
+      </w:r>
+    </w:p>
+    <w:p/>
+    <w:p>
       <w:r>
         <w:rPr>
           <w:color w:val="000000"/>
           <w:sz w:val="22"/>
           <w:szCs w:val="22"/>
         </w:rPr>
-        <w:t xml:space="preserve"> DFD, and three detailed </w:t>
-      </w:r>
-      <w:proofErr w:type="gramStart"/>
+        <w:t>Another key decision was choosing draw.io to build the final diagrams instead of basic drawing tools. Although setting up the diagrams in draw.io required extra effort to properly align shapes,Organizing curved connectors and maintaining standard DFD symbols was a tradeoff well worth it. It allowed me to produce clear, highly accurate, professional models that accurately represent the system architecture.</w:t>
+      </w:r>
+    </w:p>
+    <w:p/>
+    <w:p>
       <w:r>
         <w:rPr>
           <w:color w:val="000000"/>
           <w:sz w:val="22"/>
           <w:szCs w:val="22"/>
         </w:rPr>
-        <w:t>Level-1</w:t>
-      </w:r>
-      <w:proofErr w:type="gramEnd"/>
-      <w:r>
-        <w:rPr>
-          <w:color w:val="000000"/>
-          <w:sz w:val="22"/>
-          <w:szCs w:val="22"/>
-        </w:rPr>
-        <w:t xml:space="preserve"> DFDs for the major system processes.</w:t>
-      </w:r>
-    </w:p>
-    <w:p/>
-    <w:p>
-      <w:r>
-        <w:rPr>
-          <w:color w:val="000000"/>
-          <w:sz w:val="22"/>
-          <w:szCs w:val="22"/>
-        </w:rPr>
-        <w:t xml:space="preserve">One of the most significant challenges I faced during this task was ensuring proper balancing and consistency across the different diagram levels. Initially, I struggled to correctly map the data inputs and outputs between external entities and data stores without creating redundant flows. For instance, differentiating between read-only data accesses and write operations for the Activity, Registration, and Attendance databases required careful attention. I noticed this problem when reviewing my early sketches, where the connections appeared cluttered and hard to follow. To solve this, I systematically reviewed standard Gane-Sarson notation rules, broke down each process into distinct subprocesses, and double-checked that all incoming and outgoing data flows matched across the </w:t>
-      </w:r>
-      <w:proofErr w:type="gramStart"/>
-      <w:r>
-        <w:rPr>
-          <w:color w:val="000000"/>
-          <w:sz w:val="22"/>
-          <w:szCs w:val="22"/>
-        </w:rPr>
-        <w:t>Level-0</w:t>
-      </w:r>
-      <w:proofErr w:type="gramEnd"/>
-      <w:r>
-        <w:rPr>
-          <w:color w:val="000000"/>
-          <w:sz w:val="22"/>
-          <w:szCs w:val="22"/>
-        </w:rPr>
-        <w:t xml:space="preserve"> and </w:t>
-      </w:r>
-      <w:proofErr w:type="gramStart"/>
-      <w:r>
-        <w:rPr>
-          <w:color w:val="000000"/>
-          <w:sz w:val="22"/>
-          <w:szCs w:val="22"/>
-        </w:rPr>
-        <w:t>Level-1</w:t>
-      </w:r>
-      <w:proofErr w:type="gramEnd"/>
-      <w:r>
-        <w:rPr>
-          <w:color w:val="000000"/>
-          <w:sz w:val="22"/>
-          <w:szCs w:val="22"/>
-        </w:rPr>
-        <w:t xml:space="preserve"> diagrams.</w:t>
-      </w:r>
-    </w:p>
-    <w:p/>
-    <w:p>
-      <w:r>
-        <w:rPr>
-          <w:color w:val="000000"/>
-          <w:sz w:val="22"/>
-          <w:szCs w:val="22"/>
-        </w:rPr>
-        <w:t xml:space="preserve">Another key decision was choosing draw.io to build the final diagrams instead of basic drawing tools. Although setting up the diagrams in draw.io required extra effort to properly align </w:t>
-      </w:r>
-      <w:proofErr w:type="spellStart"/>
-      <w:proofErr w:type="gramStart"/>
-      <w:r>
-        <w:rPr>
-          <w:color w:val="000000"/>
-          <w:sz w:val="22"/>
-          <w:szCs w:val="22"/>
-        </w:rPr>
-        <w:t>shapes,Organizing</w:t>
-      </w:r>
-      <w:proofErr w:type="spellEnd"/>
-      <w:proofErr w:type="gramEnd"/>
-      <w:r>
-        <w:rPr>
-          <w:color w:val="000000"/>
-          <w:sz w:val="22"/>
-          <w:szCs w:val="22"/>
-        </w:rPr>
-        <w:t xml:space="preserve"> curved connectors and maintaining standard DFD symbols was a tradeoff well worth it. It allowed me to produce clear, highly accurate, professional models that accurately represent the system architecture.</w:t>
-      </w:r>
-    </w:p>
-    <w:p/>
-    <w:p>
-      <w:r>
-        <w:rPr>
-          <w:color w:val="000000"/>
-          <w:sz w:val="22"/>
-          <w:szCs w:val="22"/>
-        </w:rPr>
         <w:t>If I had more time to redo this project, I would conduct a peer review session with campus activity managers earlier to validate the data flow logic against real-world operations. Overall, completing this task significantly enhanced my skills in visual system design, logical process mapping, and technical problem-solving.</w:t>
       </w:r>
     </w:p>
@@ -6923,9 +6663,10 @@
     <w:p/>
     <w:p>
       <w:pPr>
-        <w:pStyle w:val="1"/>
-      </w:pPr>
-      <w:r>
+        <w:pStyle w:val="Heading1"/>
+      </w:pPr>
+      <w:r>
+        <w:lastRenderedPageBreak/>
         <w:t>Task 4</w:t>
       </w:r>
     </w:p>
@@ -6936,7 +6677,7 @@
     </w:p>
     <w:p>
       <w:pPr>
-        <w:pStyle w:val="af5"/>
+        <w:pStyle w:val="ListParagraph"/>
         <w:numPr>
           <w:ilvl w:val="0"/>
           <w:numId w:val="13"/>
@@ -6956,7 +6697,7 @@
     </w:p>
     <w:p>
       <w:pPr>
-        <w:pStyle w:val="af5"/>
+        <w:pStyle w:val="ListParagraph"/>
         <w:numPr>
           <w:ilvl w:val="0"/>
           <w:numId w:val="13"/>
@@ -6976,7 +6717,7 @@
     </w:p>
     <w:p>
       <w:pPr>
-        <w:pStyle w:val="af5"/>
+        <w:pStyle w:val="ListParagraph"/>
         <w:numPr>
           <w:ilvl w:val="0"/>
           <w:numId w:val="13"/>
@@ -7042,91 +6783,23 @@
           <w:sz w:val="32"/>
           <w:szCs w:val="32"/>
         </w:rPr>
-        <w:t xml:space="preserve">System </w:t>
-      </w:r>
-      <w:proofErr w:type="gramStart"/>
-      <w:r>
-        <w:rPr>
-          <w:b/>
-          <w:bCs/>
+        <w:t>System Actors :</w:t>
+      </w:r>
+    </w:p>
+    <w:p>
+      <w:pPr>
+        <w:rPr>
           <w:sz w:val="32"/>
           <w:szCs w:val="32"/>
         </w:rPr>
-        <w:t>Actors :</w:t>
-      </w:r>
-      <w:proofErr w:type="gramEnd"/>
-    </w:p>
-    <w:p>
-      <w:pPr>
+      </w:pPr>
+      <w:r>
         <w:rPr>
           <w:sz w:val="32"/>
           <w:szCs w:val="32"/>
         </w:rPr>
-      </w:pPr>
-      <w:r>
-        <w:rPr>
-          <w:sz w:val="32"/>
-          <w:szCs w:val="32"/>
-        </w:rPr>
-        <w:t xml:space="preserve">Based on the Student Activities </w:t>
-      </w:r>
-      <w:proofErr w:type="gramStart"/>
-      <w:r>
-        <w:rPr>
-          <w:sz w:val="32"/>
-          <w:szCs w:val="32"/>
-        </w:rPr>
-        <w:t>Management  System</w:t>
-      </w:r>
-      <w:proofErr w:type="gramEnd"/>
-      <w:r>
-        <w:rPr>
-          <w:sz w:val="32"/>
-          <w:szCs w:val="32"/>
-        </w:rPr>
-        <w:t xml:space="preserve"> </w:t>
-      </w:r>
-      <w:proofErr w:type="gramStart"/>
-      <w:r>
-        <w:rPr>
-          <w:sz w:val="32"/>
-          <w:szCs w:val="32"/>
-        </w:rPr>
-        <w:t>( SAMS</w:t>
-      </w:r>
-      <w:proofErr w:type="gramEnd"/>
-      <w:r>
-        <w:rPr>
-          <w:sz w:val="32"/>
-          <w:szCs w:val="32"/>
-        </w:rPr>
-        <w:t xml:space="preserve"> ) </w:t>
-      </w:r>
-      <w:proofErr w:type="gramStart"/>
-      <w:r>
-        <w:rPr>
-          <w:sz w:val="32"/>
-          <w:szCs w:val="32"/>
-        </w:rPr>
-        <w:t>scenario ,</w:t>
-      </w:r>
-      <w:proofErr w:type="gramEnd"/>
-      <w:r>
-        <w:rPr>
-          <w:sz w:val="32"/>
-          <w:szCs w:val="32"/>
-        </w:rPr>
-        <w:t xml:space="preserve"> the actors interact with </w:t>
-      </w:r>
-      <w:proofErr w:type="gramStart"/>
-      <w:r>
-        <w:rPr>
-          <w:sz w:val="32"/>
-          <w:szCs w:val="32"/>
-        </w:rPr>
-        <w:t>system :</w:t>
-      </w:r>
-      <w:proofErr w:type="gramEnd"/>
+        <w:t>Based on the Student Activities Management  System ( SAMS ) scenario , the actors interact with system :</w:t>
+      </w:r>
     </w:p>
     <w:p>
       <w:pPr>
@@ -7305,12 +6978,13 @@
     <w:p/>
     <w:p>
       <w:pPr>
-        <w:pStyle w:val="1"/>
+        <w:pStyle w:val="Heading1"/>
       </w:pPr>
       <w:r>
         <w:rPr>
           <w:noProof/>
         </w:rPr>
+        <w:lastRenderedPageBreak/>
         <w:drawing>
           <wp:anchor distT="0" distB="0" distL="114300" distR="114300" simplePos="0" relativeHeight="251695104" behindDoc="0" locked="0" layoutInCell="1" allowOverlap="1" wp14:anchorId="7BE7CA66" wp14:editId="56FB7D48">
             <wp:simplePos x="0" y="0"/>
@@ -7361,12 +7035,13 @@
     </w:p>
     <w:p>
       <w:pPr>
-        <w:pStyle w:val="1"/>
+        <w:pStyle w:val="Heading1"/>
       </w:pPr>
       <w:r>
         <w:rPr>
           <w:noProof/>
         </w:rPr>
+        <w:lastRenderedPageBreak/>
         <w:drawing>
           <wp:anchor distT="0" distB="0" distL="114300" distR="114300" simplePos="0" relativeHeight="251694080" behindDoc="0" locked="0" layoutInCell="1" allowOverlap="1" wp14:anchorId="221FBD28" wp14:editId="6719021A">
             <wp:simplePos x="0" y="0"/>
@@ -7414,12 +7089,13 @@
     </w:p>
     <w:p>
       <w:pPr>
-        <w:pStyle w:val="1"/>
+        <w:pStyle w:val="Heading1"/>
       </w:pPr>
       <w:r>
         <w:rPr>
           <w:noProof/>
         </w:rPr>
+        <w:lastRenderedPageBreak/>
         <w:drawing>
           <wp:anchor distT="0" distB="0" distL="114300" distR="114300" simplePos="0" relativeHeight="251696128" behindDoc="0" locked="0" layoutInCell="1" allowOverlap="1" wp14:anchorId="51275347" wp14:editId="5F949611">
             <wp:simplePos x="0" y="0"/>
@@ -7470,9 +7146,10 @@
     </w:p>
     <w:p>
       <w:pPr>
-        <w:pStyle w:val="1"/>
-      </w:pPr>
-      <w:r>
+        <w:pStyle w:val="Heading1"/>
+      </w:pPr>
+      <w:r>
+        <w:lastRenderedPageBreak/>
         <w:t xml:space="preserve"> </w:t>
       </w:r>
     </w:p>
@@ -7562,21 +7239,20 @@
         <w:rPr>
           <w:lang w:eastAsia="ja-JP"/>
         </w:rPr>
-        <w:t xml:space="preserve">The </w:t>
-      </w:r>
-      <w:proofErr w:type="gramStart"/>
-      <w:r>
+        <w:t>The hands on implementation process involved developing, refining, and formatting three major operational use cases: Register for Activities, Create and Publish Activities, and Approve or Reject Activities. To ensure full compliance with rigorous system analysis methodologies, I structured each process using a comprehensive template. This required explicitly defining critical system boundaries and operational parameters, such as precise Triggers, Preconditions, Minimal Guarantees, and Success Guarantees. Doing so guaranteed that expected system behaviors are fully accounted for under both standard operational flows and complex exception handling scenarios.</w:t>
+      </w:r>
+    </w:p>
+    <w:p>
+      <w:pPr>
         <w:rPr>
           <w:lang w:eastAsia="ja-JP"/>
         </w:rPr>
-        <w:t>hands on</w:t>
-      </w:r>
-      <w:proofErr w:type="gramEnd"/>
+      </w:pPr>
       <w:r>
         <w:rPr>
           <w:lang w:eastAsia="ja-JP"/>
         </w:rPr>
-        <w:t xml:space="preserve"> implementation process involved developing, refining, and formatting three major operational use cases: Register for Activities, Create and Publish Activities, and Approve or Reject Activities. To ensure full compliance with rigorous system analysis methodologies, I structured each process using a comprehensive template. This required explicitly defining critical system boundaries and operational parameters, such as precise Triggers, Preconditions, Minimal Guarantees, and Success Guarantees. Doing so guaranteed that expected system behaviors are fully accounted for under both standard operational flows and complex exception handling scenarios.</w:t>
+        <w:t>Furthermore, incorporating detailed extension scenarios,such as handling registration validation, enforcing input requirements, and mandating administrative feedback during activity rejections significantly enhanced the logical integrity and robustness of the documentation. From a technical execution standpoint, utilizing advanced diagramming tools allowed me to present these workflows through clean, organized visual tables. Structuring the fields carefully ensured high readability and a clear separation of responsibilities among system actors, including students, activity organizers, and the student affairs department. Refining these text based use case specifications also helped clarify the exact state transitions and database interactions required for each individual feature, ensuring that every edge case is properly mapped out.</w:t>
       </w:r>
     </w:p>
     <w:p>
@@ -7589,71 +7265,20 @@
         <w:rPr>
           <w:lang w:eastAsia="ja-JP"/>
         </w:rPr>
-        <w:t xml:space="preserve">Furthermore, incorporating detailed extension </w:t>
-      </w:r>
-      <w:proofErr w:type="spellStart"/>
-      <w:proofErr w:type="gramStart"/>
-      <w:r>
+        <w:t>Overall, this task successfully bridged the gap between theoretical systems analysis and practical application, reinforcing the importance of precise technical documentation and systematic workflow design. These finalized use case templates will serve as a solid, reliable blueprint for subsequent design and implementation phases, ensuring structural consistency across the entire project lifecycle</w:t>
+      </w:r>
+    </w:p>
+    <w:p>
+      <w:pPr>
         <w:rPr>
           <w:lang w:eastAsia="ja-JP"/>
         </w:rPr>
-        <w:t>scenarios,such</w:t>
-      </w:r>
-      <w:proofErr w:type="spellEnd"/>
-      <w:proofErr w:type="gramEnd"/>
-      <w:r>
-        <w:rPr>
-          <w:lang w:eastAsia="ja-JP"/>
-        </w:rPr>
-        <w:t xml:space="preserve"> as handling registration validation, enforcing input requirements, and mandating administrative feedback during activity rejections significantly enhanced the logical integrity and robustness of the documentation. From a technical execution standpoint, utilizing advanced diagramming tools allowed me to present these workflows through clean, organized visual tables. Structuring the fields carefully ensured high readability and a clear separation of responsibilities among system actors, including students, activity organizers, and the student affairs department. Refining these </w:t>
-      </w:r>
-      <w:proofErr w:type="gramStart"/>
-      <w:r>
-        <w:rPr>
-          <w:lang w:eastAsia="ja-JP"/>
-        </w:rPr>
-        <w:t>text based</w:t>
-      </w:r>
-      <w:proofErr w:type="gramEnd"/>
-      <w:r>
-        <w:rPr>
-          <w:lang w:eastAsia="ja-JP"/>
-        </w:rPr>
-        <w:t xml:space="preserve"> use case specifications also helped clarify the exact state transitions and database interactions required for each individual feature, ensuring that every edge case is properly mapped out.</w:t>
-      </w:r>
-    </w:p>
-    <w:p>
-      <w:pPr>
-        <w:rPr>
-          <w:lang w:eastAsia="ja-JP"/>
-        </w:rPr>
-      </w:pPr>
-      <w:r>
-        <w:rPr>
-          <w:lang w:eastAsia="ja-JP"/>
-        </w:rPr>
-        <w:t>Overall, this task successfully bridged the gap between theoretical systems analysis and practical application, reinforcing the importance of precise technical documentation and systematic workflow design. These finalized use case templates will serve as a solid, reliable blueprint for subsequent design and implementation phases, ensuring structural consistency across the entire project lifecycle</w:t>
-      </w:r>
-    </w:p>
-    <w:p>
-      <w:pPr>
-        <w:rPr>
-          <w:lang w:eastAsia="ja-JP"/>
-        </w:rPr>
-      </w:pPr>
-    </w:p>
-    <w:p>
-      <w:pPr>
-        <w:rPr>
-          <w:lang w:eastAsia="ja-JP"/>
-        </w:rPr>
       </w:pPr>
     </w:p>
     <w:p>
       <w:pPr>
         <w:bidi/>
         <w:rPr>
-          <w:rFonts w:hint="cs"/>
           <w:rtl/>
           <w:lang w:eastAsia="ja-JP"/>
         </w:rPr>
@@ -7661,9 +7286,10 @@
     </w:p>
     <w:p>
       <w:pPr>
-        <w:pStyle w:val="1"/>
-      </w:pPr>
-      <w:r>
+        <w:pStyle w:val="Heading1"/>
+      </w:pPr>
+      <w:r>
+        <w:lastRenderedPageBreak/>
         <w:t>Task 5</w:t>
       </w:r>
     </w:p>
@@ -7773,9 +7399,10 @@
     <w:p/>
     <w:p>
       <w:pPr>
-        <w:pStyle w:val="1"/>
-      </w:pPr>
-      <w:r>
+        <w:pStyle w:val="Heading1"/>
+      </w:pPr>
+      <w:r>
+        <w:lastRenderedPageBreak/>
         <w:t>Task 6</w:t>
       </w:r>
     </w:p>
@@ -7803,6 +7430,55 @@
           <w:color w:val="EE0000"/>
         </w:rPr>
         <w:t xml:space="preserve"> marks]</w:t>
+      </w:r>
+    </w:p>
+    <w:p/>
+    <w:p>
+      <w:pPr>
+        <w:rPr>
+          <w:rFonts w:hint="cs"/>
+          <w:rtl/>
+        </w:rPr>
+      </w:pPr>
+      <w:r>
+        <w:rPr>
+          <w:noProof/>
+        </w:rPr>
+        <w:drawing>
+          <wp:inline distT="0" distB="0" distL="0" distR="0" wp14:anchorId="14F985DB" wp14:editId="59CA7FBC">
+            <wp:extent cx="5349240" cy="6332855"/>
+            <wp:effectExtent l="0" t="0" r="3810" b="0"/>
+            <wp:docPr id="1955099929" name="Picture 12"/>
+            <wp:cNvGraphicFramePr>
+              <a:graphicFrameLocks xmlns:a="http://schemas.openxmlformats.org/drawingml/2006/main" noChangeAspect="1"/>
+            </wp:cNvGraphicFramePr>
+            <a:graphic xmlns:a="http://schemas.openxmlformats.org/drawingml/2006/main">
+              <a:graphicData uri="http://schemas.openxmlformats.org/drawingml/2006/picture">
+                <pic:pic xmlns:pic="http://schemas.openxmlformats.org/drawingml/2006/picture">
+                  <pic:nvPicPr>
+                    <pic:cNvPr id="1955099929" name="Picture 1955099929"/>
+                    <pic:cNvPicPr/>
+                  </pic:nvPicPr>
+                  <pic:blipFill>
+                    <a:blip r:embed="rId29"/>
+                    <a:stretch>
+                      <a:fillRect/>
+                    </a:stretch>
+                  </pic:blipFill>
+                  <pic:spPr>
+                    <a:xfrm>
+                      <a:off x="0" y="0"/>
+                      <a:ext cx="5349240" cy="6332855"/>
+                    </a:xfrm>
+                    <a:prstGeom prst="rect">
+                      <a:avLst/>
+                    </a:prstGeom>
+                  </pic:spPr>
+                </pic:pic>
+              </a:graphicData>
+            </a:graphic>
+          </wp:inline>
+        </w:drawing>
       </w:r>
     </w:p>
     <w:p/>
@@ -7812,17 +7488,12 @@
     <w:p/>
     <w:p/>
     <w:p/>
-    <w:p/>
-    <w:p/>
-    <w:p/>
-    <w:p/>
-    <w:p/>
-    <w:p/>
-    <w:p>
-      <w:pPr>
-        <w:pStyle w:val="1"/>
-      </w:pPr>
-      <w:r>
+    <w:p>
+      <w:pPr>
+        <w:pStyle w:val="Heading1"/>
+      </w:pPr>
+      <w:r>
+        <w:lastRenderedPageBreak/>
         <w:t>Task 7</w:t>
       </w:r>
     </w:p>
@@ -7854,7 +7525,7 @@
     </w:p>
     <w:p/>
     <w:sectPr>
-      <w:headerReference w:type="default" r:id="rId29"/>
+      <w:headerReference w:type="default" r:id="rId30"/>
       <w:pgSz w:w="12240" w:h="15840" w:code="1"/>
       <w:pgMar w:top="1080" w:right="720" w:bottom="2160" w:left="3096" w:header="1080" w:footer="720" w:gutter="0"/>
       <w:pgNumType w:start="1"/>
@@ -7892,7 +7563,7 @@
 <w:ftr xmlns:wpc="http://schemas.microsoft.com/office/word/2010/wordprocessingCanvas" xmlns:cx="http://schemas.microsoft.com/office/drawing/2014/chartex" xmlns:cx1="http://schemas.microsoft.com/office/drawing/2015/9/8/chartex" xmlns:cx2="http://schemas.microsoft.com/office/drawing/2015/10/21/chartex" xmlns:cx3="http://schemas.microsoft.com/office/drawing/2016/5/9/chartex" xmlns:cx4="http://schemas.microsoft.com/office/drawing/2016/5/10/chartex" xmlns:cx5="http://schemas.microsoft.com/office/drawing/2016/5/11/chartex" xmlns:cx6="http://schemas.microsoft.com/office/drawing/2016/5/12/chartex" xmlns:cx7="http://schemas.microsoft.com/office/drawing/2016/5/13/chartex" xmlns:cx8="http://schemas.microsoft.com/office/drawing/2016/5/14/chartex" xmlns:mc="http://schemas.openxmlformats.org/markup-compatibility/2006" xmlns:aink="http://schemas.microsoft.com/office/drawing/2016/ink" xmlns:am3d="http://schemas.microsoft.com/office/drawing/2017/model3d" xmlns:o="urn:schemas-microsoft-com:office:office" xmlns:oel="http://schemas.microsoft.com/office/2019/extlst" xmlns:r="http://schemas.openxmlformats.org/officeDocument/2006/relationships" xmlns:m="http://schemas.openxmlformats.org/officeDocument/2006/math" xmlns:v="urn:schemas-microsoft-com:vml" xmlns:wp14="http://schemas.microsoft.com/office/word/2010/wordprocessingDrawing" xmlns:wp="http://schemas.openxmlformats.org/drawingml/2006/wordprocessingDrawing" xmlns:w10="urn:schemas-microsoft-com:office:word" xmlns:w="http://schemas.openxmlformats.org/wordprocessingml/2006/main" xmlns:w14="http://schemas.microsoft.com/office/word/2010/wordml" xmlns:w15="http://schemas.microsoft.com/office/word/2012/wordml" xmlns:w16cex="http://schemas.microsoft.com/office/word/2018/wordml/cex" xmlns:w16cid="http://schemas.microsoft.com/office/word/2016/wordml/cid" xmlns:w16="http://schemas.microsoft.com/office/word/2018/wordml" xmlns:w16du="http://schemas.microsoft.com/office/word/2023/wordml/word16du" xmlns:w16sdtdh="http://schemas.microsoft.com/office/word/2020/wordml/sdtdatahash" xmlns:w16sdtfl="http://schemas.microsoft.com/office/word/2024/wordml/sdtformatlock" xmlns:w16se="http://schemas.microsoft.com/office/word/2015/wordml/symex" xmlns:wpg="http://schemas.microsoft.com/office/word/2010/wordprocessingGroup" xmlns:wpi="http://schemas.microsoft.com/office/word/2010/wordprocessingInk" xmlns:wne="http://schemas.microsoft.com/office/word/2006/wordml" xmlns:wps="http://schemas.microsoft.com/office/word/2010/wordprocessingShape" mc:Ignorable="w14 w15 w16se w16cid w16 w16cex w16sdtdh w16sdtfl w16du wp14">
   <w:p>
     <w:pPr>
-      <w:pStyle w:val="a5"/>
+      <w:pStyle w:val="Footer"/>
     </w:pPr>
     <w:r>
       <w:rPr>
@@ -8047,7 +7718,7 @@
 <w:ftr xmlns:wpc="http://schemas.microsoft.com/office/word/2010/wordprocessingCanvas" xmlns:cx="http://schemas.microsoft.com/office/drawing/2014/chartex" xmlns:cx1="http://schemas.microsoft.com/office/drawing/2015/9/8/chartex" xmlns:cx2="http://schemas.microsoft.com/office/drawing/2015/10/21/chartex" xmlns:cx3="http://schemas.microsoft.com/office/drawing/2016/5/9/chartex" xmlns:cx4="http://schemas.microsoft.com/office/drawing/2016/5/10/chartex" xmlns:cx5="http://schemas.microsoft.com/office/drawing/2016/5/11/chartex" xmlns:cx6="http://schemas.microsoft.com/office/drawing/2016/5/12/chartex" xmlns:cx7="http://schemas.microsoft.com/office/drawing/2016/5/13/chartex" xmlns:cx8="http://schemas.microsoft.com/office/drawing/2016/5/14/chartex" xmlns:mc="http://schemas.openxmlformats.org/markup-compatibility/2006" xmlns:aink="http://schemas.microsoft.com/office/drawing/2016/ink" xmlns:am3d="http://schemas.microsoft.com/office/drawing/2017/model3d" xmlns:o="urn:schemas-microsoft-com:office:office" xmlns:oel="http://schemas.microsoft.com/office/2019/extlst" xmlns:r="http://schemas.openxmlformats.org/officeDocument/2006/relationships" xmlns:m="http://schemas.openxmlformats.org/officeDocument/2006/math" xmlns:v="urn:schemas-microsoft-com:vml" xmlns:wp14="http://schemas.microsoft.com/office/word/2010/wordprocessingDrawing" xmlns:wp="http://schemas.openxmlformats.org/drawingml/2006/wordprocessingDrawing" xmlns:w10="urn:schemas-microsoft-com:office:word" xmlns:w="http://schemas.openxmlformats.org/wordprocessingml/2006/main" xmlns:w14="http://schemas.microsoft.com/office/word/2010/wordml" xmlns:w15="http://schemas.microsoft.com/office/word/2012/wordml" xmlns:w16cex="http://schemas.microsoft.com/office/word/2018/wordml/cex" xmlns:w16cid="http://schemas.microsoft.com/office/word/2016/wordml/cid" xmlns:w16="http://schemas.microsoft.com/office/word/2018/wordml" xmlns:w16du="http://schemas.microsoft.com/office/word/2023/wordml/word16du" xmlns:w16sdtdh="http://schemas.microsoft.com/office/word/2020/wordml/sdtdatahash" xmlns:w16sdtfl="http://schemas.microsoft.com/office/word/2024/wordml/sdtformatlock" xmlns:w16se="http://schemas.microsoft.com/office/word/2015/wordml/symex" xmlns:wpg="http://schemas.microsoft.com/office/word/2010/wordprocessingGroup" xmlns:wpi="http://schemas.microsoft.com/office/word/2010/wordprocessingInk" xmlns:wne="http://schemas.microsoft.com/office/word/2006/wordml" xmlns:wps="http://schemas.microsoft.com/office/word/2010/wordprocessingShape" mc:Ignorable="w14 w15 w16se w16cid w16 w16cex w16sdtdh w16sdtfl w16du wp14">
   <w:p>
     <w:pPr>
-      <w:pStyle w:val="a5"/>
+      <w:pStyle w:val="Footer"/>
     </w:pPr>
     <w:r>
       <w:rPr>
@@ -8202,7 +7873,7 @@
 <w:ftr xmlns:wpc="http://schemas.microsoft.com/office/word/2010/wordprocessingCanvas" xmlns:cx="http://schemas.microsoft.com/office/drawing/2014/chartex" xmlns:cx1="http://schemas.microsoft.com/office/drawing/2015/9/8/chartex" xmlns:cx2="http://schemas.microsoft.com/office/drawing/2015/10/21/chartex" xmlns:cx3="http://schemas.microsoft.com/office/drawing/2016/5/9/chartex" xmlns:cx4="http://schemas.microsoft.com/office/drawing/2016/5/10/chartex" xmlns:cx5="http://schemas.microsoft.com/office/drawing/2016/5/11/chartex" xmlns:cx6="http://schemas.microsoft.com/office/drawing/2016/5/12/chartex" xmlns:cx7="http://schemas.microsoft.com/office/drawing/2016/5/13/chartex" xmlns:cx8="http://schemas.microsoft.com/office/drawing/2016/5/14/chartex" xmlns:mc="http://schemas.openxmlformats.org/markup-compatibility/2006" xmlns:aink="http://schemas.microsoft.com/office/drawing/2016/ink" xmlns:am3d="http://schemas.microsoft.com/office/drawing/2017/model3d" xmlns:o="urn:schemas-microsoft-com:office:office" xmlns:oel="http://schemas.microsoft.com/office/2019/extlst" xmlns:r="http://schemas.openxmlformats.org/officeDocument/2006/relationships" xmlns:m="http://schemas.openxmlformats.org/officeDocument/2006/math" xmlns:v="urn:schemas-microsoft-com:vml" xmlns:wp14="http://schemas.microsoft.com/office/word/2010/wordprocessingDrawing" xmlns:wp="http://schemas.openxmlformats.org/drawingml/2006/wordprocessingDrawing" xmlns:w10="urn:schemas-microsoft-com:office:word" xmlns:w="http://schemas.openxmlformats.org/wordprocessingml/2006/main" xmlns:w14="http://schemas.microsoft.com/office/word/2010/wordml" xmlns:w15="http://schemas.microsoft.com/office/word/2012/wordml" xmlns:w16cex="http://schemas.microsoft.com/office/word/2018/wordml/cex" xmlns:w16cid="http://schemas.microsoft.com/office/word/2016/wordml/cid" xmlns:w16="http://schemas.microsoft.com/office/word/2018/wordml" xmlns:w16du="http://schemas.microsoft.com/office/word/2023/wordml/word16du" xmlns:w16sdtdh="http://schemas.microsoft.com/office/word/2020/wordml/sdtdatahash" xmlns:w16sdtfl="http://schemas.microsoft.com/office/word/2024/wordml/sdtformatlock" xmlns:w16se="http://schemas.microsoft.com/office/word/2015/wordml/symex" xmlns:wpg="http://schemas.microsoft.com/office/word/2010/wordprocessingGroup" xmlns:wpi="http://schemas.microsoft.com/office/word/2010/wordprocessingInk" xmlns:wne="http://schemas.microsoft.com/office/word/2006/wordml" xmlns:wps="http://schemas.microsoft.com/office/word/2010/wordprocessingShape" mc:Ignorable="w14 w15 w16se w16cid w16 w16cex w16sdtdh w16sdtfl w16du wp14">
   <w:p>
     <w:pPr>
-      <w:pStyle w:val="a5"/>
+      <w:pStyle w:val="Footer"/>
     </w:pPr>
     <w:r>
       <w:rPr>
@@ -8441,7 +8112,7 @@
         </w:tcPr>
         <w:p>
           <w:pPr>
-            <w:pStyle w:val="a7"/>
+            <w:pStyle w:val="Header"/>
           </w:pPr>
         </w:p>
       </w:tc>
@@ -8451,7 +8122,7 @@
         </w:tcPr>
         <w:p>
           <w:pPr>
-            <w:pStyle w:val="a7"/>
+            <w:pStyle w:val="Header"/>
           </w:pPr>
         </w:p>
       </w:tc>
@@ -8462,7 +8133,7 @@
         </w:tcPr>
         <w:p>
           <w:pPr>
-            <w:pStyle w:val="a7"/>
+            <w:pStyle w:val="Header"/>
           </w:pPr>
         </w:p>
       </w:tc>
@@ -8470,7 +8141,7 @@
   </w:tbl>
   <w:p>
     <w:pPr>
-      <w:pStyle w:val="a7"/>
+      <w:pStyle w:val="Header"/>
     </w:pPr>
   </w:p>
 </w:hdr>
@@ -8754,32 +8425,9 @@
           </w:r>
           <w:r>
             <w:rPr>
-              <w:rFonts w:hint="cs"/>
-              <w:b w:val="0"/>
-              <w:bCs w:val="0"/>
-              <w:noProof/>
-              <w:rtl/>
-            </w:rPr>
-            <w:instrText xml:space="preserve">خطأ! استخدم علامة التبويب "الصفحة الرئيسية" لتطبيق </w:instrText>
-          </w:r>
-          <w:r>
-            <w:rPr>
-              <w:rFonts w:hint="cs"/>
-              <w:b w:val="0"/>
-              <w:bCs w:val="0"/>
               <w:noProof/>
             </w:rPr>
-            <w:instrText>Heading 1</w:instrText>
-          </w:r>
-          <w:r>
-            <w:rPr>
-              <w:rFonts w:hint="cs"/>
-              <w:b w:val="0"/>
-              <w:bCs w:val="0"/>
-              <w:noProof/>
-              <w:rtl/>
-            </w:rPr>
-            <w:instrText xml:space="preserve"> على النص الذي ترغب في أن يظهر هنا.</w:instrText>
+            <w:instrText>Task 6</w:instrText>
           </w:r>
           <w:r>
             <w:rPr>
@@ -8810,32 +8458,9 @@
           </w:r>
           <w:r>
             <w:rPr>
-              <w:rFonts w:hint="cs"/>
-              <w:b w:val="0"/>
-              <w:bCs w:val="0"/>
-              <w:noProof/>
-              <w:rtl/>
-            </w:rPr>
-            <w:instrText xml:space="preserve">خطأ! استخدم علامة التبويب "الصفحة الرئيسية" لتطبيق </w:instrText>
-          </w:r>
-          <w:r>
-            <w:rPr>
-              <w:rFonts w:hint="cs"/>
-              <w:b w:val="0"/>
-              <w:bCs w:val="0"/>
               <w:noProof/>
             </w:rPr>
-            <w:instrText>Heading 1</w:instrText>
-          </w:r>
-          <w:r>
-            <w:rPr>
-              <w:rFonts w:hint="cs"/>
-              <w:b w:val="0"/>
-              <w:bCs w:val="0"/>
-              <w:noProof/>
-              <w:rtl/>
-            </w:rPr>
-            <w:instrText xml:space="preserve"> على النص الذي ترغب في أن يظهر هنا.</w:instrText>
+            <w:instrText>Task 6</w:instrText>
           </w:r>
           <w:r>
             <w:rPr>
@@ -8851,38 +8476,9 @@
           </w:r>
           <w:r>
             <w:rPr>
-              <w:rFonts w:hint="cs"/>
-              <w:b w:val="0"/>
-              <w:bCs w:val="0"/>
-              <w:noProof/>
-              <w:rtl/>
-            </w:rPr>
-            <w:t xml:space="preserve">خطأ! استخدم علامة التبويب "الصفحة الرئيسية" لتطبيق </w:t>
-          </w:r>
-          <w:r>
-            <w:rPr>
-              <w:rFonts w:hint="cs"/>
-              <w:b w:val="0"/>
-              <w:bCs w:val="0"/>
               <w:noProof/>
             </w:rPr>
-            <w:t>Heading 1</w:t>
-          </w:r>
-          <w:r>
-            <w:rPr>
-              <w:rFonts w:hint="cs"/>
-              <w:b w:val="0"/>
-              <w:bCs w:val="0"/>
-              <w:noProof/>
-              <w:rtl/>
-            </w:rPr>
-            <w:t xml:space="preserve"> على النص الذي ترغب في أن يظهر هنا.</w:t>
-          </w:r>
-          <w:r>
-            <w:rPr>
-              <w:noProof/>
-            </w:rPr>
-            <w:t xml:space="preserve"> </w:t>
+            <w:t xml:space="preserve">Task 6 </w:t>
           </w:r>
           <w:r>
             <w:fldChar w:fldCharType="end"/>
@@ -8948,7 +8544,7 @@
     <w:lvl w:ilvl="0">
       <w:start w:val="1"/>
       <w:numFmt w:val="bullet"/>
-      <w:pStyle w:val="a"/>
+      <w:pStyle w:val="ListBullet"/>
       <w:lvlText w:val="•"/>
       <w:lvlJc w:val="left"/>
       <w:pPr>
@@ -9636,7 +9232,7 @@
     <w:lvl w:ilvl="0">
       <w:start w:val="1"/>
       <w:numFmt w:val="decimal"/>
-      <w:pStyle w:val="a0"/>
+      <w:pStyle w:val="ListNumber"/>
       <w:lvlText w:val="%1."/>
       <w:lvlJc w:val="left"/>
       <w:pPr>
@@ -9650,7 +9246,7 @@
     <w:lvl w:ilvl="1">
       <w:start w:val="1"/>
       <w:numFmt w:val="decimal"/>
-      <w:pStyle w:val="2"/>
+      <w:pStyle w:val="ListNumber2"/>
       <w:suff w:val="space"/>
       <w:lvlText w:val="%1.%2"/>
       <w:lvlJc w:val="left"/>
@@ -9665,7 +9261,7 @@
     <w:lvl w:ilvl="2">
       <w:start w:val="1"/>
       <w:numFmt w:val="lowerLetter"/>
-      <w:pStyle w:val="3"/>
+      <w:pStyle w:val="ListNumber3"/>
       <w:lvlText w:val="%3."/>
       <w:lvlJc w:val="left"/>
       <w:pPr>
@@ -9679,7 +9275,7 @@
     <w:lvl w:ilvl="3">
       <w:start w:val="1"/>
       <w:numFmt w:val="lowerRoman"/>
-      <w:pStyle w:val="4"/>
+      <w:pStyle w:val="ListNumber4"/>
       <w:lvlText w:val="%4."/>
       <w:lvlJc w:val="left"/>
       <w:pPr>
@@ -9693,7 +9289,7 @@
     <w:lvl w:ilvl="4">
       <w:start w:val="1"/>
       <w:numFmt w:val="lowerLetter"/>
-      <w:pStyle w:val="5"/>
+      <w:pStyle w:val="ListNumber5"/>
       <w:lvlText w:val="(%5)"/>
       <w:lvlJc w:val="left"/>
       <w:pPr>
@@ -11769,7 +11365,7 @@
     <w:lsdException w:name="Unresolved Mention" w:semiHidden="1" w:unhideWhenUsed="1"/>
     <w:lsdException w:name="Smart Link" w:semiHidden="1" w:unhideWhenUsed="1"/>
   </w:latentStyles>
-  <w:style w:type="paragraph" w:default="1" w:styleId="a1">
+  <w:style w:type="paragraph" w:default="1" w:styleId="Normal">
     <w:name w:val="Normal"/>
     <w:qFormat/>
     <w:rsid w:val="00137F57"/>
@@ -11784,11 +11380,11 @@
       <w:lang w:eastAsia="en-US"/>
     </w:rPr>
   </w:style>
-  <w:style w:type="paragraph" w:styleId="1">
+  <w:style w:type="paragraph" w:styleId="Heading1">
     <w:name w:val="heading 1"/>
-    <w:basedOn w:val="a1"/>
-    <w:next w:val="a1"/>
-    <w:link w:val="1Char"/>
+    <w:basedOn w:val="Normal"/>
+    <w:next w:val="Normal"/>
+    <w:link w:val="Heading1Char"/>
     <w:uiPriority w:val="1"/>
     <w:qFormat/>
     <w:pPr>
@@ -11809,11 +11405,11 @@
       <w:lang w:eastAsia="ja-JP"/>
     </w:rPr>
   </w:style>
-  <w:style w:type="paragraph" w:styleId="20">
+  <w:style w:type="paragraph" w:styleId="Heading2">
     <w:name w:val="heading 2"/>
-    <w:basedOn w:val="a1"/>
-    <w:next w:val="a1"/>
-    <w:link w:val="2Char"/>
+    <w:basedOn w:val="Normal"/>
+    <w:next w:val="Normal"/>
+    <w:link w:val="Heading2Char"/>
     <w:uiPriority w:val="1"/>
     <w:unhideWhenUsed/>
     <w:qFormat/>
@@ -11833,11 +11429,11 @@
       <w:lang w:eastAsia="ja-JP"/>
     </w:rPr>
   </w:style>
-  <w:style w:type="paragraph" w:styleId="30">
+  <w:style w:type="paragraph" w:styleId="Heading3">
     <w:name w:val="heading 3"/>
-    <w:basedOn w:val="a1"/>
-    <w:next w:val="a1"/>
-    <w:link w:val="3Char"/>
+    <w:basedOn w:val="Normal"/>
+    <w:next w:val="Normal"/>
+    <w:link w:val="Heading3Char"/>
     <w:uiPriority w:val="1"/>
     <w:semiHidden/>
     <w:unhideWhenUsed/>
@@ -11855,13 +11451,12 @@
       <w:lang w:eastAsia="ja-JP"/>
     </w:rPr>
   </w:style>
-  <w:style w:type="character" w:default="1" w:styleId="a2">
+  <w:style w:type="character" w:default="1" w:styleId="DefaultParagraphFont">
     <w:name w:val="Default Paragraph Font"/>
     <w:uiPriority w:val="1"/>
-    <w:semiHidden/>
     <w:unhideWhenUsed/>
   </w:style>
-  <w:style w:type="table" w:default="1" w:styleId="a3">
+  <w:style w:type="table" w:default="1" w:styleId="TableNormal">
     <w:name w:val="Normal Table"/>
     <w:uiPriority w:val="99"/>
     <w:semiHidden/>
@@ -11876,16 +11471,16 @@
       </w:tblCellMar>
     </w:tblPr>
   </w:style>
-  <w:style w:type="numbering" w:default="1" w:styleId="a4">
+  <w:style w:type="numbering" w:default="1" w:styleId="NoList">
     <w:name w:val="No List"/>
     <w:uiPriority w:val="99"/>
     <w:semiHidden/>
     <w:unhideWhenUsed/>
   </w:style>
-  <w:style w:type="paragraph" w:styleId="a5">
+  <w:style w:type="paragraph" w:styleId="Footer">
     <w:name w:val="footer"/>
-    <w:basedOn w:val="a1"/>
-    <w:link w:val="Char"/>
+    <w:basedOn w:val="Normal"/>
+    <w:link w:val="FooterChar"/>
     <w:uiPriority w:val="99"/>
     <w:unhideWhenUsed/>
     <w:qFormat/>
@@ -11900,20 +11495,20 @@
       <w:lang w:eastAsia="ja-JP"/>
     </w:rPr>
   </w:style>
-  <w:style w:type="character" w:customStyle="1" w:styleId="Char">
-    <w:name w:val="تذييل الصفحة Char"/>
-    <w:basedOn w:val="a2"/>
-    <w:link w:val="a5"/>
+  <w:style w:type="character" w:customStyle="1" w:styleId="FooterChar">
+    <w:name w:val="Footer Char"/>
+    <w:basedOn w:val="DefaultParagraphFont"/>
+    <w:link w:val="Footer"/>
     <w:uiPriority w:val="99"/>
     <w:rPr>
       <w:color w:val="EF4623" w:themeColor="accent1"/>
     </w:rPr>
   </w:style>
-  <w:style w:type="paragraph" w:styleId="a6">
+  <w:style w:type="paragraph" w:styleId="Subtitle">
     <w:name w:val="Subtitle"/>
-    <w:basedOn w:val="a1"/>
-    <w:next w:val="a1"/>
-    <w:link w:val="Char0"/>
+    <w:basedOn w:val="Normal"/>
+    <w:next w:val="Normal"/>
+    <w:link w:val="SubtitleChar"/>
     <w:uiPriority w:val="3"/>
     <w:unhideWhenUsed/>
     <w:qFormat/>
@@ -11938,7 +11533,7 @@
   </w:style>
   <w:style w:type="paragraph" w:customStyle="1" w:styleId="Graphic">
     <w:name w:val="Graphic"/>
-    <w:basedOn w:val="a1"/>
+    <w:basedOn w:val="Normal"/>
     <w:uiPriority w:val="99"/>
     <w:pPr>
       <w:spacing w:after="80"/>
@@ -11952,10 +11547,10 @@
       <w:lang w:eastAsia="ja-JP"/>
     </w:rPr>
   </w:style>
-  <w:style w:type="paragraph" w:styleId="a7">
+  <w:style w:type="paragraph" w:styleId="Header">
     <w:name w:val="header"/>
-    <w:basedOn w:val="a1"/>
-    <w:link w:val="Char1"/>
+    <w:basedOn w:val="Normal"/>
+    <w:link w:val="HeaderChar"/>
     <w:uiPriority w:val="99"/>
     <w:qFormat/>
     <w:pPr>
@@ -11969,19 +11564,19 @@
       <w:lang w:eastAsia="ja-JP"/>
     </w:rPr>
   </w:style>
-  <w:style w:type="character" w:customStyle="1" w:styleId="Char1">
-    <w:name w:val="رأس الصفحة Char"/>
-    <w:basedOn w:val="a2"/>
-    <w:link w:val="a7"/>
+  <w:style w:type="character" w:customStyle="1" w:styleId="HeaderChar">
+    <w:name w:val="Header Char"/>
+    <w:basedOn w:val="DefaultParagraphFont"/>
+    <w:link w:val="Header"/>
     <w:uiPriority w:val="99"/>
     <w:rPr>
       <w:color w:val="404040" w:themeColor="text1" w:themeTint="BF"/>
       <w:sz w:val="20"/>
     </w:rPr>
   </w:style>
-  <w:style w:type="table" w:styleId="a8">
+  <w:style w:type="table" w:styleId="TableGrid">
     <w:name w:val="Table Grid"/>
-    <w:basedOn w:val="a3"/>
+    <w:basedOn w:val="TableNormal"/>
     <w:uiPriority w:val="59"/>
     <w:pPr>
       <w:spacing w:before="120" w:after="120" w:line="240" w:lineRule="auto"/>
@@ -12038,7 +11633,7 @@
   </w:style>
   <w:style w:type="paragraph" w:customStyle="1" w:styleId="InfoHeading">
     <w:name w:val="Info Heading"/>
-    <w:basedOn w:val="a1"/>
+    <w:basedOn w:val="Normal"/>
     <w:uiPriority w:val="2"/>
     <w:qFormat/>
     <w:pPr>
@@ -12058,8 +11653,8 @@
   </w:style>
   <w:style w:type="paragraph" w:customStyle="1" w:styleId="Page">
     <w:name w:val="Page"/>
-    <w:basedOn w:val="a1"/>
-    <w:next w:val="a1"/>
+    <w:basedOn w:val="Normal"/>
+    <w:next w:val="Normal"/>
     <w:uiPriority w:val="99"/>
     <w:unhideWhenUsed/>
     <w:qFormat/>
@@ -12075,11 +11670,11 @@
       <w:lang w:eastAsia="ja-JP"/>
     </w:rPr>
   </w:style>
-  <w:style w:type="paragraph" w:styleId="a9">
+  <w:style w:type="paragraph" w:styleId="Title">
     <w:name w:val="Title"/>
-    <w:basedOn w:val="a1"/>
-    <w:next w:val="a1"/>
-    <w:link w:val="Char2"/>
+    <w:basedOn w:val="Normal"/>
+    <w:next w:val="Normal"/>
+    <w:link w:val="TitleChar"/>
     <w:uiPriority w:val="2"/>
     <w:qFormat/>
     <w:pPr>
@@ -12095,10 +11690,10 @@
       <w:lang w:eastAsia="ja-JP"/>
     </w:rPr>
   </w:style>
-  <w:style w:type="character" w:customStyle="1" w:styleId="Char2">
-    <w:name w:val="العنوان Char"/>
-    <w:basedOn w:val="a2"/>
-    <w:link w:val="a9"/>
+  <w:style w:type="character" w:customStyle="1" w:styleId="TitleChar">
+    <w:name w:val="Title Char"/>
+    <w:basedOn w:val="DefaultParagraphFont"/>
+    <w:link w:val="Title"/>
     <w:uiPriority w:val="2"/>
     <w:rPr>
       <w:rFonts w:asciiTheme="majorHAnsi" w:eastAsiaTheme="majorEastAsia" w:hAnsiTheme="majorHAnsi" w:cstheme="majorBidi"/>
@@ -12108,19 +11703,19 @@
       <w:sz w:val="200"/>
     </w:rPr>
   </w:style>
-  <w:style w:type="character" w:styleId="aa">
+  <w:style w:type="character" w:styleId="PlaceholderText">
     <w:name w:val="Placeholder Text"/>
-    <w:basedOn w:val="a2"/>
+    <w:basedOn w:val="DefaultParagraphFont"/>
     <w:uiPriority w:val="99"/>
     <w:semiHidden/>
     <w:rPr>
       <w:color w:val="808080"/>
     </w:rPr>
   </w:style>
-  <w:style w:type="paragraph" w:styleId="ab">
+  <w:style w:type="paragraph" w:styleId="BalloonText">
     <w:name w:val="Balloon Text"/>
-    <w:basedOn w:val="a1"/>
-    <w:link w:val="Char3"/>
+    <w:basedOn w:val="Normal"/>
+    <w:link w:val="BalloonTextChar"/>
     <w:uiPriority w:val="99"/>
     <w:semiHidden/>
     <w:unhideWhenUsed/>
@@ -12132,10 +11727,10 @@
       <w:lang w:eastAsia="ja-JP"/>
     </w:rPr>
   </w:style>
-  <w:style w:type="character" w:customStyle="1" w:styleId="Char3">
-    <w:name w:val="نص في بالون Char"/>
-    <w:basedOn w:val="a2"/>
-    <w:link w:val="ab"/>
+  <w:style w:type="character" w:customStyle="1" w:styleId="BalloonTextChar">
+    <w:name w:val="Balloon Text Char"/>
+    <w:basedOn w:val="DefaultParagraphFont"/>
+    <w:link w:val="BalloonText"/>
     <w:uiPriority w:val="99"/>
     <w:semiHidden/>
     <w:rPr>
@@ -12143,9 +11738,9 @@
       <w:sz w:val="16"/>
     </w:rPr>
   </w:style>
-  <w:style w:type="character" w:styleId="ac">
+  <w:style w:type="character" w:styleId="Strong">
     <w:name w:val="Strong"/>
-    <w:basedOn w:val="a2"/>
+    <w:basedOn w:val="DefaultParagraphFont"/>
     <w:uiPriority w:val="10"/>
     <w:qFormat/>
     <w:rPr>
@@ -12153,10 +11748,10 @@
       <w:bCs/>
     </w:rPr>
   </w:style>
-  <w:style w:type="character" w:customStyle="1" w:styleId="Char0">
-    <w:name w:val="عنوان فرعي Char"/>
-    <w:basedOn w:val="a2"/>
-    <w:link w:val="a6"/>
+  <w:style w:type="character" w:customStyle="1" w:styleId="SubtitleChar">
+    <w:name w:val="Subtitle Char"/>
+    <w:basedOn w:val="DefaultParagraphFont"/>
+    <w:link w:val="Subtitle"/>
     <w:uiPriority w:val="3"/>
     <w:rPr>
       <w:rFonts w:asciiTheme="majorHAnsi" w:eastAsiaTheme="majorEastAsia" w:hAnsiTheme="majorHAnsi" w:cstheme="majorBidi"/>
@@ -12170,7 +11765,7 @@
   </w:style>
   <w:style w:type="paragraph" w:customStyle="1" w:styleId="Abstract">
     <w:name w:val="Abstract"/>
-    <w:basedOn w:val="a1"/>
+    <w:basedOn w:val="Normal"/>
     <w:uiPriority w:val="3"/>
     <w:qFormat/>
     <w:pPr>
@@ -12187,9 +11782,9 @@
       <w:lang w:eastAsia="ja-JP"/>
     </w:rPr>
   </w:style>
-  <w:style w:type="paragraph" w:styleId="ad">
+  <w:style w:type="paragraph" w:styleId="NoSpacing">
     <w:name w:val="No Spacing"/>
-    <w:link w:val="Char4"/>
+    <w:link w:val="NoSpacingChar"/>
     <w:uiPriority w:val="1"/>
     <w:unhideWhenUsed/>
     <w:qFormat/>
@@ -12199,7 +11794,7 @@
   </w:style>
   <w:style w:type="character" w:styleId="Hyperlink">
     <w:name w:val="Hyperlink"/>
-    <w:basedOn w:val="a2"/>
+    <w:basedOn w:val="DefaultParagraphFont"/>
     <w:uiPriority w:val="99"/>
     <w:unhideWhenUsed/>
     <w:rPr>
@@ -12207,10 +11802,10 @@
       <w:u w:val="single"/>
     </w:rPr>
   </w:style>
-  <w:style w:type="paragraph" w:styleId="10">
+  <w:style w:type="paragraph" w:styleId="TOC1">
     <w:name w:val="toc 1"/>
-    <w:basedOn w:val="a1"/>
-    <w:next w:val="a1"/>
+    <w:basedOn w:val="Normal"/>
+    <w:next w:val="Normal"/>
     <w:autoRedefine/>
     <w:uiPriority w:val="39"/>
     <w:unhideWhenUsed/>
@@ -12230,10 +11825,10 @@
       <w:lang w:eastAsia="ja-JP"/>
     </w:rPr>
   </w:style>
-  <w:style w:type="character" w:customStyle="1" w:styleId="1Char">
-    <w:name w:val="العنوان 1 Char"/>
-    <w:basedOn w:val="a2"/>
-    <w:link w:val="1"/>
+  <w:style w:type="character" w:customStyle="1" w:styleId="Heading1Char">
+    <w:name w:val="Heading 1 Char"/>
+    <w:basedOn w:val="DefaultParagraphFont"/>
+    <w:link w:val="Heading1"/>
     <w:uiPriority w:val="1"/>
     <w:rPr>
       <w:rFonts w:asciiTheme="majorHAnsi" w:eastAsiaTheme="majorEastAsia" w:hAnsiTheme="majorHAnsi" w:cstheme="majorBidi"/>
@@ -12243,10 +11838,10 @@
       <w:sz w:val="40"/>
     </w:rPr>
   </w:style>
-  <w:style w:type="paragraph" w:styleId="ae">
+  <w:style w:type="paragraph" w:styleId="TOCHeading">
     <w:name w:val="TOC Heading"/>
-    <w:basedOn w:val="1"/>
-    <w:next w:val="a1"/>
+    <w:basedOn w:val="Heading1"/>
+    <w:next w:val="Normal"/>
     <w:uiPriority w:val="39"/>
     <w:unhideWhenUsed/>
     <w:qFormat/>
@@ -12263,10 +11858,10 @@
       <w:sz w:val="44"/>
     </w:rPr>
   </w:style>
-  <w:style w:type="character" w:customStyle="1" w:styleId="2Char">
-    <w:name w:val="عنوان 2 Char"/>
-    <w:basedOn w:val="a2"/>
-    <w:link w:val="20"/>
+  <w:style w:type="character" w:customStyle="1" w:styleId="Heading2Char">
+    <w:name w:val="Heading 2 Char"/>
+    <w:basedOn w:val="DefaultParagraphFont"/>
+    <w:link w:val="Heading2"/>
     <w:uiPriority w:val="1"/>
     <w:rPr>
       <w:rFonts w:asciiTheme="majorHAnsi" w:eastAsiaTheme="majorEastAsia" w:hAnsiTheme="majorHAnsi" w:cstheme="majorBidi"/>
@@ -12276,11 +11871,11 @@
       <w:sz w:val="28"/>
     </w:rPr>
   </w:style>
-  <w:style w:type="paragraph" w:styleId="af">
+  <w:style w:type="paragraph" w:styleId="Quote">
     <w:name w:val="Quote"/>
-    <w:basedOn w:val="a1"/>
-    <w:next w:val="a1"/>
-    <w:link w:val="Char5"/>
+    <w:basedOn w:val="Normal"/>
+    <w:next w:val="Normal"/>
+    <w:link w:val="QuoteChar"/>
     <w:uiPriority w:val="1"/>
     <w:unhideWhenUsed/>
     <w:qFormat/>
@@ -12297,10 +11892,10 @@
       <w:lang w:eastAsia="ja-JP"/>
     </w:rPr>
   </w:style>
-  <w:style w:type="character" w:customStyle="1" w:styleId="Char5">
-    <w:name w:val="اقتباس Char"/>
-    <w:basedOn w:val="a2"/>
-    <w:link w:val="af"/>
+  <w:style w:type="character" w:customStyle="1" w:styleId="QuoteChar">
+    <w:name w:val="Quote Char"/>
+    <w:basedOn w:val="DefaultParagraphFont"/>
+    <w:link w:val="Quote"/>
     <w:uiPriority w:val="1"/>
     <w:rPr>
       <w:i/>
@@ -12310,10 +11905,10 @@
       <w:sz w:val="24"/>
     </w:rPr>
   </w:style>
-  <w:style w:type="paragraph" w:styleId="af0">
+  <w:style w:type="paragraph" w:styleId="Signature">
     <w:name w:val="Signature"/>
-    <w:basedOn w:val="a1"/>
-    <w:link w:val="Char6"/>
+    <w:basedOn w:val="Normal"/>
+    <w:link w:val="SignatureChar"/>
     <w:uiPriority w:val="9"/>
     <w:unhideWhenUsed/>
     <w:qFormat/>
@@ -12330,25 +11925,25 @@
       <w:lang w:eastAsia="ja-JP"/>
     </w:rPr>
   </w:style>
-  <w:style w:type="character" w:customStyle="1" w:styleId="Char6">
-    <w:name w:val="توقيع Char"/>
-    <w:basedOn w:val="a2"/>
-    <w:link w:val="af0"/>
+  <w:style w:type="character" w:customStyle="1" w:styleId="SignatureChar">
+    <w:name w:val="Signature Char"/>
+    <w:basedOn w:val="DefaultParagraphFont"/>
+    <w:link w:val="Signature"/>
     <w:uiPriority w:val="9"/>
     <w:rPr>
       <w:color w:val="595959" w:themeColor="text1" w:themeTint="A6"/>
       <w:kern w:val="20"/>
     </w:rPr>
   </w:style>
-  <w:style w:type="character" w:customStyle="1" w:styleId="Char4">
-    <w:name w:val="بلا تباعد Char"/>
-    <w:basedOn w:val="a2"/>
-    <w:link w:val="ad"/>
+  <w:style w:type="character" w:customStyle="1" w:styleId="NoSpacingChar">
+    <w:name w:val="No Spacing Char"/>
+    <w:basedOn w:val="DefaultParagraphFont"/>
+    <w:link w:val="NoSpacing"/>
     <w:uiPriority w:val="1"/>
   </w:style>
-  <w:style w:type="paragraph" w:styleId="a">
+  <w:style w:type="paragraph" w:styleId="ListBullet">
     <w:name w:val="List Bullet"/>
-    <w:basedOn w:val="a1"/>
+    <w:basedOn w:val="Normal"/>
     <w:uiPriority w:val="1"/>
     <w:unhideWhenUsed/>
     <w:qFormat/>
@@ -12367,9 +11962,9 @@
       <w:lang w:eastAsia="ja-JP"/>
     </w:rPr>
   </w:style>
-  <w:style w:type="paragraph" w:styleId="a0">
+  <w:style w:type="paragraph" w:styleId="ListNumber">
     <w:name w:val="List Number"/>
-    <w:basedOn w:val="a1"/>
+    <w:basedOn w:val="Normal"/>
     <w:uiPriority w:val="1"/>
     <w:unhideWhenUsed/>
     <w:qFormat/>
@@ -12389,9 +11984,9 @@
       <w:lang w:eastAsia="ja-JP"/>
     </w:rPr>
   </w:style>
-  <w:style w:type="paragraph" w:styleId="2">
+  <w:style w:type="paragraph" w:styleId="ListNumber2">
     <w:name w:val="List Number 2"/>
-    <w:basedOn w:val="a1"/>
+    <w:basedOn w:val="Normal"/>
     <w:uiPriority w:val="1"/>
     <w:unhideWhenUsed/>
     <w:qFormat/>
@@ -12412,9 +12007,9 @@
       <w:lang w:eastAsia="ja-JP"/>
     </w:rPr>
   </w:style>
-  <w:style w:type="paragraph" w:styleId="3">
+  <w:style w:type="paragraph" w:styleId="ListNumber3">
     <w:name w:val="List Number 3"/>
-    <w:basedOn w:val="a1"/>
+    <w:basedOn w:val="Normal"/>
     <w:uiPriority w:val="18"/>
     <w:unhideWhenUsed/>
     <w:pPr>
@@ -12434,9 +12029,9 @@
       <w:lang w:eastAsia="ja-JP"/>
     </w:rPr>
   </w:style>
-  <w:style w:type="paragraph" w:styleId="4">
+  <w:style w:type="paragraph" w:styleId="ListNumber4">
     <w:name w:val="List Number 4"/>
-    <w:basedOn w:val="a1"/>
+    <w:basedOn w:val="Normal"/>
     <w:uiPriority w:val="18"/>
     <w:unhideWhenUsed/>
     <w:pPr>
@@ -12456,9 +12051,9 @@
       <w:lang w:eastAsia="ja-JP"/>
     </w:rPr>
   </w:style>
-  <w:style w:type="paragraph" w:styleId="5">
+  <w:style w:type="paragraph" w:styleId="ListNumber5">
     <w:name w:val="List Number 5"/>
-    <w:basedOn w:val="a1"/>
+    <w:basedOn w:val="Normal"/>
     <w:uiPriority w:val="18"/>
     <w:unhideWhenUsed/>
     <w:pPr>
@@ -12480,7 +12075,7 @@
   </w:style>
   <w:style w:type="table" w:customStyle="1" w:styleId="FinancialTable">
     <w:name w:val="Financial Table"/>
-    <w:basedOn w:val="a3"/>
+    <w:basedOn w:val="TableNormal"/>
     <w:uiPriority w:val="99"/>
     <w:pPr>
       <w:spacing w:before="60" w:after="60" w:line="240" w:lineRule="auto"/>
@@ -12522,9 +12117,9 @@
       </w:rPr>
     </w:tblStylePr>
   </w:style>
-  <w:style w:type="character" w:styleId="af1">
+  <w:style w:type="character" w:styleId="CommentReference">
     <w:name w:val="annotation reference"/>
-    <w:basedOn w:val="a2"/>
+    <w:basedOn w:val="DefaultParagraphFont"/>
     <w:uiPriority w:val="99"/>
     <w:semiHidden/>
     <w:unhideWhenUsed/>
@@ -12532,10 +12127,10 @@
       <w:sz w:val="16"/>
     </w:rPr>
   </w:style>
-  <w:style w:type="paragraph" w:styleId="af2">
+  <w:style w:type="paragraph" w:styleId="CommentText">
     <w:name w:val="annotation text"/>
-    <w:basedOn w:val="a1"/>
-    <w:link w:val="Char7"/>
+    <w:basedOn w:val="Normal"/>
+    <w:link w:val="CommentTextChar"/>
     <w:uiPriority w:val="99"/>
     <w:unhideWhenUsed/>
     <w:pPr>
@@ -12549,17 +12144,17 @@
       <w:lang w:eastAsia="ja-JP"/>
     </w:rPr>
   </w:style>
-  <w:style w:type="character" w:customStyle="1" w:styleId="Char7">
-    <w:name w:val="نص تعليق Char"/>
-    <w:basedOn w:val="a2"/>
-    <w:link w:val="af2"/>
+  <w:style w:type="character" w:customStyle="1" w:styleId="CommentTextChar">
+    <w:name w:val="Comment Text Char"/>
+    <w:basedOn w:val="DefaultParagraphFont"/>
+    <w:link w:val="CommentText"/>
     <w:uiPriority w:val="99"/>
   </w:style>
-  <w:style w:type="paragraph" w:styleId="af3">
+  <w:style w:type="paragraph" w:styleId="CommentSubject">
     <w:name w:val="annotation subject"/>
-    <w:basedOn w:val="af2"/>
-    <w:next w:val="af2"/>
-    <w:link w:val="Char8"/>
+    <w:basedOn w:val="CommentText"/>
+    <w:next w:val="CommentText"/>
+    <w:link w:val="CommentSubjectChar"/>
     <w:uiPriority w:val="99"/>
     <w:semiHidden/>
     <w:unhideWhenUsed/>
@@ -12568,10 +12163,10 @@
       <w:bCs/>
     </w:rPr>
   </w:style>
-  <w:style w:type="character" w:customStyle="1" w:styleId="Char8">
-    <w:name w:val="موضوع تعليق Char"/>
-    <w:basedOn w:val="Char7"/>
-    <w:link w:val="af3"/>
+  <w:style w:type="character" w:customStyle="1" w:styleId="CommentSubjectChar">
+    <w:name w:val="Comment Subject Char"/>
+    <w:basedOn w:val="CommentTextChar"/>
+    <w:link w:val="CommentSubject"/>
     <w:uiPriority w:val="99"/>
     <w:semiHidden/>
     <w:rPr>
@@ -12579,9 +12174,9 @@
       <w:bCs/>
     </w:rPr>
   </w:style>
-  <w:style w:type="table" w:styleId="af4">
+  <w:style w:type="table" w:styleId="LightShading">
     <w:name w:val="Light Shading"/>
-    <w:basedOn w:val="a3"/>
+    <w:basedOn w:val="TableNormal"/>
     <w:uiPriority w:val="60"/>
     <w:pPr>
       <w:spacing w:after="0" w:line="240" w:lineRule="auto"/>
@@ -12676,7 +12271,7 @@
   </w:style>
   <w:style w:type="paragraph" w:customStyle="1" w:styleId="TableTextDecimal">
     <w:name w:val="Table Text Decimal"/>
-    <w:basedOn w:val="a1"/>
+    <w:basedOn w:val="Normal"/>
     <w:uiPriority w:val="1"/>
     <w:qFormat/>
     <w:pPr>
@@ -12695,7 +12290,7 @@
   </w:style>
   <w:style w:type="paragraph" w:customStyle="1" w:styleId="TableText">
     <w:name w:val="Table Text"/>
-    <w:basedOn w:val="a1"/>
+    <w:basedOn w:val="Normal"/>
     <w:uiPriority w:val="1"/>
     <w:qFormat/>
     <w:pPr>
@@ -12711,7 +12306,7 @@
   </w:style>
   <w:style w:type="paragraph" w:customStyle="1" w:styleId="Organization">
     <w:name w:val="Organization"/>
-    <w:basedOn w:val="a1"/>
+    <w:basedOn w:val="Normal"/>
     <w:uiPriority w:val="2"/>
     <w:qFormat/>
     <w:pPr>
@@ -12728,9 +12323,9 @@
       <w:lang w:eastAsia="ja-JP"/>
     </w:rPr>
   </w:style>
-  <w:style w:type="paragraph" w:styleId="af5">
+  <w:style w:type="paragraph" w:styleId="ListParagraph">
     <w:name w:val="List Paragraph"/>
-    <w:basedOn w:val="a1"/>
+    <w:basedOn w:val="Normal"/>
     <w:uiPriority w:val="34"/>
     <w:qFormat/>
     <w:rsid w:val="001B698D"/>
@@ -12747,9 +12342,9 @@
       <w:lang w:eastAsia="ja-JP"/>
     </w:rPr>
   </w:style>
-  <w:style w:type="character" w:styleId="af6">
+  <w:style w:type="character" w:styleId="UnresolvedMention">
     <w:name w:val="Unresolved Mention"/>
-    <w:basedOn w:val="a2"/>
+    <w:basedOn w:val="DefaultParagraphFont"/>
     <w:uiPriority w:val="99"/>
     <w:semiHidden/>
     <w:unhideWhenUsed/>
@@ -12759,10 +12354,10 @@
       <w:shd w:val="clear" w:color="auto" w:fill="E1DFDD"/>
     </w:rPr>
   </w:style>
-  <w:style w:type="character" w:customStyle="1" w:styleId="3Char">
-    <w:name w:val="عنوان 3 Char"/>
-    <w:basedOn w:val="a2"/>
-    <w:link w:val="30"/>
+  <w:style w:type="character" w:customStyle="1" w:styleId="Heading3Char">
+    <w:name w:val="Heading 3 Char"/>
+    <w:basedOn w:val="DefaultParagraphFont"/>
+    <w:link w:val="Heading3"/>
     <w:uiPriority w:val="1"/>
     <w:semiHidden/>
     <w:rsid w:val="00667896"/>
@@ -12773,9 +12368,9 @@
       <w:szCs w:val="24"/>
     </w:rPr>
   </w:style>
-  <w:style w:type="paragraph" w:styleId="af7">
+  <w:style w:type="paragraph" w:styleId="NormalWeb">
     <w:name w:val="Normal (Web)"/>
-    <w:basedOn w:val="a1"/>
+    <w:basedOn w:val="Normal"/>
     <w:uiPriority w:val="99"/>
     <w:semiHidden/>
     <w:unhideWhenUsed/>
@@ -12947,15 +12542,12 @@
     <w:sig w:usb0="800020AF" w:usb1="C000A04A" w:usb2="00000008" w:usb3="00000000" w:csb0="00000041" w:csb1="00000000"/>
   </w:font>
   <w:font w:name="Yu Mincho">
-    <w:altName w:val="游明朝"/>
-    <w:panose1 w:val="02020400000000000000"/>
     <w:charset w:val="80"/>
     <w:family w:val="roman"/>
     <w:pitch w:val="variable"/>
     <w:sig w:usb0="800002E7" w:usb1="2AC7FCFF" w:usb2="00000012" w:usb3="00000000" w:csb0="0002009F" w:csb1="00000000"/>
   </w:font>
   <w:font w:name="Yu Gothic Light">
-    <w:altName w:val="游ゴシック Light"/>
     <w:panose1 w:val="020B0300000000000000"/>
     <w:charset w:val="80"/>
     <w:family w:val="swiss"/>
@@ -12980,7 +12572,7 @@
     <w:lvl w:ilvl="0">
       <w:start w:val="1"/>
       <w:numFmt w:val="bullet"/>
-      <w:pStyle w:val="a"/>
+      <w:pStyle w:val="ListBullet"/>
       <w:lvlText w:val="•"/>
       <w:lvlJc w:val="left"/>
       <w:pPr>
@@ -13021,8 +12613,10 @@
     <w:rsid w:val="0018073C"/>
     <w:rsid w:val="001A632E"/>
     <w:rsid w:val="001B2DF6"/>
+    <w:rsid w:val="001E28D6"/>
     <w:rsid w:val="00207A61"/>
     <w:rsid w:val="00261066"/>
+    <w:rsid w:val="002F572F"/>
     <w:rsid w:val="00324ACF"/>
     <w:rsid w:val="00351A43"/>
     <w:rsid w:val="003B2F21"/>
@@ -13053,6 +12647,7 @@
     <w:rsid w:val="00AF3CCC"/>
     <w:rsid w:val="00B2031C"/>
     <w:rsid w:val="00B4602D"/>
+    <w:rsid w:val="00BA04D8"/>
     <w:rsid w:val="00BB41A5"/>
     <w:rsid w:val="00C14CD2"/>
     <w:rsid w:val="00C346F5"/>
@@ -13075,9 +12670,12 @@
     <w:rsid w:val="00E575CD"/>
     <w:rsid w:val="00E770AC"/>
     <w:rsid w:val="00EC4ADB"/>
+    <w:rsid w:val="00EF2D5F"/>
+    <w:rsid w:val="00F2201C"/>
     <w:rsid w:val="00F42A55"/>
     <w:rsid w:val="00F55C51"/>
     <w:rsid w:val="00F6554B"/>
+    <w:rsid w:val="00F97C1A"/>
   </w:rsids>
   <m:mathPr>
     <m:mathFont m:val="Cambria Math"/>
@@ -13095,7 +12693,7 @@
   <w:themeFontLang w:val="en-GB" w:eastAsia="ja-JP" w:bidi="ar-SA"/>
   <w:clrSchemeMapping w:bg1="light1" w:t1="dark1" w:bg2="light2" w:t2="dark2" w:accent1="accent1" w:accent2="accent2" w:accent3="accent3" w:accent4="accent4" w:accent5="accent5" w:accent6="accent6" w:hyperlink="hyperlink" w:followedHyperlink="followedHyperlink"/>
   <w:decimalSymbol w:val="."/>
-  <w:listSeparator w:val=","/>
+  <w:listSeparator w:val=";"/>
   <w15:chartTrackingRefBased/>
 </w:settings>
 </file>
@@ -13495,17 +13093,17 @@
     <w:lsdException w:name="Unresolved Mention" w:semiHidden="1" w:unhideWhenUsed="1"/>
     <w:lsdException w:name="Smart Link" w:semiHidden="1" w:unhideWhenUsed="1"/>
   </w:latentStyles>
-  <w:style w:type="paragraph" w:default="1" w:styleId="a0">
+  <w:style w:type="paragraph" w:default="1" w:styleId="Normal">
     <w:name w:val="Normal"/>
     <w:qFormat/>
   </w:style>
-  <w:style w:type="character" w:default="1" w:styleId="a1">
+  <w:style w:type="character" w:default="1" w:styleId="DefaultParagraphFont">
     <w:name w:val="Default Paragraph Font"/>
     <w:uiPriority w:val="1"/>
     <w:semiHidden/>
     <w:unhideWhenUsed/>
   </w:style>
-  <w:style w:type="table" w:default="1" w:styleId="a2">
+  <w:style w:type="table" w:default="1" w:styleId="TableNormal">
     <w:name w:val="Normal Table"/>
     <w:uiPriority w:val="99"/>
     <w:semiHidden/>
@@ -13520,15 +13118,15 @@
       </w:tblCellMar>
     </w:tblPr>
   </w:style>
-  <w:style w:type="numbering" w:default="1" w:styleId="a3">
+  <w:style w:type="numbering" w:default="1" w:styleId="NoList">
     <w:name w:val="No List"/>
     <w:uiPriority w:val="99"/>
     <w:semiHidden/>
     <w:unhideWhenUsed/>
   </w:style>
-  <w:style w:type="paragraph" w:styleId="a">
+  <w:style w:type="paragraph" w:styleId="ListBullet">
     <w:name w:val="List Bullet"/>
-    <w:basedOn w:val="a0"/>
+    <w:basedOn w:val="Normal"/>
     <w:uiPriority w:val="1"/>
     <w:unhideWhenUsed/>
     <w:qFormat/>
@@ -13545,9 +13143,9 @@
       <w:lang w:val="en-US" w:eastAsia="en-US"/>
     </w:rPr>
   </w:style>
-  <w:style w:type="character" w:styleId="a4">
+  <w:style w:type="character" w:styleId="Strong">
     <w:name w:val="Strong"/>
-    <w:basedOn w:val="a1"/>
+    <w:basedOn w:val="DefaultParagraphFont"/>
     <w:uiPriority w:val="10"/>
     <w:qFormat/>
     <w:rPr>
@@ -13902,16 +13500,16 @@
 </file>
 
 <file path=customXml/item2.xml><?xml version="1.0" encoding="utf-8"?>
-<b:Sources xmlns:b="http://schemas.openxmlformats.org/officeDocument/2006/bibliography" SelectedStyle="\APA.XSL" StyleName="APA"/>
-</file>
-
-<file path=customXml/item3.xml><?xml version="1.0" encoding="utf-8"?>
 <?mso-contentType ?>
 <FormTemplates xmlns="http://schemas.microsoft.com/sharepoint/v3/contenttype/forms">
   <Display>DocumentLibraryForm</Display>
   <Edit>AssetEditForm</Edit>
   <New>DocumentLibraryForm</New>
 </FormTemplates>
+</file>
+
+<file path=customXml/item3.xml><?xml version="1.0" encoding="utf-8"?>
+<b:Sources xmlns:b="http://schemas.openxmlformats.org/officeDocument/2006/bibliography" SelectedStyle="\APA.XSL" StyleName="APA"/>
 </file>
 
 <file path=customXml/itemProps1.xml><?xml version="1.0" encoding="utf-8"?>
@@ -13923,17 +13521,17 @@
 </file>
 
 <file path=customXml/itemProps2.xml><?xml version="1.0" encoding="utf-8"?>
+<ds:datastoreItem xmlns:ds="http://schemas.openxmlformats.org/officeDocument/2006/customXml" ds:itemID="{E34C63B7-A026-4A37-9535-4FBB4C03A11D}">
+  <ds:schemaRefs>
+    <ds:schemaRef ds:uri="http://schemas.microsoft.com/sharepoint/v3/contenttype/forms"/>
+  </ds:schemaRefs>
+</ds:datastoreItem>
+</file>
+
+<file path=customXml/itemProps3.xml><?xml version="1.0" encoding="utf-8"?>
 <ds:datastoreItem xmlns:ds="http://schemas.openxmlformats.org/officeDocument/2006/customXml" ds:itemID="{355C5113-D031-41DB-A6D8-43CE1A0E6695}">
   <ds:schemaRefs>
     <ds:schemaRef ds:uri="http://schemas.openxmlformats.org/officeDocument/2006/bibliography"/>
   </ds:schemaRefs>
 </ds:datastoreItem>
-</file>
-
-<file path=customXml/itemProps3.xml><?xml version="1.0" encoding="utf-8"?>
-<ds:datastoreItem xmlns:ds="http://schemas.openxmlformats.org/officeDocument/2006/customXml" ds:itemID="{E34C63B7-A026-4A37-9535-4FBB4C03A11D}">
-  <ds:schemaRefs>
-    <ds:schemaRef ds:uri="http://schemas.microsoft.com/sharepoint/v3/contenttype/forms"/>
-  </ds:schemaRefs>
-</ds:datastoreItem>
 </file>
</xml_diff>